<commit_message>
chore(auto): actualizar cartas con 63 estudiantes y 17 firmas [2026-10-22 03:40]
</commit_message>
<xml_diff>
--- a/cartas_solicitud/Carta_Solicitud_ELE0300116_ELECTIVA_III-MATEMATICA_FINANCIERA.docx
+++ b/cartas_solicitud/Carta_Solicitud_ELE0300116_ELECTIVA_III-MATEMATICA_FINANCIERA.docx
@@ -11,7 +11,7 @@
           <w:color w:val="646464"/>
           <w:sz w:val="20"/>
         </w:rPr>
-        <w:t>Neiva, Huila, Octubre de 2026</w:t>
+        <w:t>Neiva, Huila, 22 de octubre de 2026</w:t>
         <w:br/>
       </w:r>
     </w:p>
@@ -88,7 +88,7 @@
         <w:br/>
         <w:t>• Semestre del Plan de Estudios: Semestre 9°</w:t>
         <w:br/>
-        <w:t>• Total de Estudiantes Solicitantes Preinscritos: 15 estudiantes</w:t>
+        <w:t>• Total de Estudiantes Solicitantes Preinscritos: 18 estudiantes</w:t>
       </w:r>
     </w:p>
     <w:p>
@@ -97,7 +97,7 @@
         <w:jc w:val="both"/>
       </w:pPr>
       <w:r>
-        <w:t>Manifestamos nuestro compromiso formal de matricula y cumplimiento con los requerimientos académicos y arancelarios correspondientes al curso vacacional. Dado que contamos con un grupo sólido de 15 estudiantes interesados (superando ampliamente el cupo mínimo requerido de 10 estudiantes), solicitamos su valiosa gestión ante la Coordinación Académica y la Dirección de Programa para su respectiva aprobación, asignación docente y programación de horarios.</w:t>
+        <w:t>Manifestamos nuestro compromiso formal de matrícula y cumplimiento con los requerimientos académicos y arancelarios correspondientes al curso vacacional. Dado que contamos con un grupo sólido de 18 estudiantes interesados (superando el cupo mínimo requerido de 10 estudiantes), solicitamos su valiosa gestión ante la Coordinación Académica y la Dirección de Programa para su respectiva aprobación, asignación docente y programación de horarios.</w:t>
       </w:r>
     </w:p>
     <w:p>
@@ -591,11 +591,38 @@
               <w:jc w:val="center"/>
             </w:pPr>
             <w:r>
-              <w:rPr>
-                <w:color w:val="A0A0A0"/>
-                <w:sz w:val="15"/>
-              </w:rPr>
-              <w:t>____________________</w:t>
+              <w:drawing>
+                <wp:inline xmlns:a="http://schemas.openxmlformats.org/drawingml/2006/main" xmlns:pic="http://schemas.openxmlformats.org/drawingml/2006/picture">
+                  <wp:extent cx="810668" cy="292608"/>
+                  <wp:docPr id="1" name="Picture 1"/>
+                  <wp:cNvGraphicFramePr>
+                    <a:graphicFrameLocks noChangeAspect="1"/>
+                  </wp:cNvGraphicFramePr>
+                  <a:graphic>
+                    <a:graphicData uri="http://schemas.openxmlformats.org/drawingml/2006/picture">
+                      <pic:pic>
+                        <pic:nvPicPr>
+                          <pic:cNvPr id="0" name="image.png"/>
+                          <pic:cNvPicPr/>
+                        </pic:nvPicPr>
+                        <pic:blipFill>
+                          <a:blip r:embed="rId9"/>
+                          <a:stretch>
+                            <a:fillRect/>
+                          </a:stretch>
+                        </pic:blipFill>
+                        <pic:spPr>
+                          <a:xfrm>
+                            <a:off x="0" y="0"/>
+                            <a:ext cx="810668" cy="292608"/>
+                          </a:xfrm>
+                          <a:prstGeom prst="rect"/>
+                        </pic:spPr>
+                      </pic:pic>
+                    </a:graphicData>
+                  </a:graphic>
+                </wp:inline>
+              </w:drawing>
             </w:r>
           </w:p>
         </w:tc>
@@ -873,7 +900,7 @@
                 <w:b/>
                 <w:sz w:val="17"/>
               </w:rPr>
-              <w:t>Luis Quevedo</w:t>
+              <w:t>Deiver Yesid Mantilla Vergara</w:t>
             </w:r>
           </w:p>
         </w:tc>
@@ -896,7 +923,7 @@
               <w:rPr>
                 <w:sz w:val="17"/>
               </w:rPr>
-              <w:t>1075208119</w:t>
+              <w:t>ELE120251027</w:t>
             </w:r>
           </w:p>
         </w:tc>
@@ -919,7 +946,7 @@
               <w:rPr>
                 <w:sz w:val="17"/>
               </w:rPr>
-              <w:t>3157056179</w:t>
+              <w:t>3125970130</w:t>
             </w:r>
           </w:p>
         </w:tc>
@@ -1105,7 +1132,7 @@
                 <w:b/>
                 <w:sz w:val="17"/>
               </w:rPr>
-              <w:t>Farid jaramillo</w:t>
+              <w:t>Ricardo Rodriguez</w:t>
             </w:r>
           </w:p>
         </w:tc>
@@ -1128,7 +1155,7 @@
               <w:rPr>
                 <w:sz w:val="17"/>
               </w:rPr>
-              <w:t>ELE202232</w:t>
+              <w:t>1108937084</w:t>
             </w:r>
           </w:p>
         </w:tc>
@@ -1151,7 +1178,7 @@
               <w:rPr>
                 <w:sz w:val="17"/>
               </w:rPr>
-              <w:t>3233843904</w:t>
+              <w:t>3229849503</w:t>
             </w:r>
           </w:p>
         </w:tc>
@@ -1171,11 +1198,38 @@
               <w:jc w:val="center"/>
             </w:pPr>
             <w:r>
-              <w:rPr>
-                <w:color w:val="A0A0A0"/>
-                <w:sz w:val="15"/>
-              </w:rPr>
-              <w:t>____________________</w:t>
+              <w:drawing>
+                <wp:inline xmlns:a="http://schemas.openxmlformats.org/drawingml/2006/main" xmlns:pic="http://schemas.openxmlformats.org/drawingml/2006/picture">
+                  <wp:extent cx="875538" cy="292608"/>
+                  <wp:docPr id="2" name="Picture 2"/>
+                  <wp:cNvGraphicFramePr>
+                    <a:graphicFrameLocks noChangeAspect="1"/>
+                  </wp:cNvGraphicFramePr>
+                  <a:graphic>
+                    <a:graphicData uri="http://schemas.openxmlformats.org/drawingml/2006/picture">
+                      <pic:pic>
+                        <pic:nvPicPr>
+                          <pic:cNvPr id="0" name="image.png"/>
+                          <pic:cNvPicPr/>
+                        </pic:nvPicPr>
+                        <pic:blipFill>
+                          <a:blip r:embed="rId10"/>
+                          <a:stretch>
+                            <a:fillRect/>
+                          </a:stretch>
+                        </pic:blipFill>
+                        <pic:spPr>
+                          <a:xfrm>
+                            <a:off x="0" y="0"/>
+                            <a:ext cx="875538" cy="292608"/>
+                          </a:xfrm>
+                          <a:prstGeom prst="rect"/>
+                        </pic:spPr>
+                      </pic:pic>
+                    </a:graphicData>
+                  </a:graphic>
+                </wp:inline>
+              </w:drawing>
             </w:r>
           </w:p>
         </w:tc>
@@ -1221,7 +1275,7 @@
                 <w:b/>
                 <w:sz w:val="17"/>
               </w:rPr>
-              <w:t>Ricardo Rodriguez</w:t>
+              <w:t>Hermes Morales</w:t>
             </w:r>
           </w:p>
         </w:tc>
@@ -1244,7 +1298,7 @@
               <w:rPr>
                 <w:sz w:val="17"/>
               </w:rPr>
-              <w:t>1108937084</w:t>
+              <w:t>1006003970</w:t>
             </w:r>
           </w:p>
         </w:tc>
@@ -1267,7 +1321,7 @@
               <w:rPr>
                 <w:sz w:val="17"/>
               </w:rPr>
-              <w:t>3229849503</w:t>
+              <w:t>3204731899</w:t>
             </w:r>
           </w:p>
         </w:tc>
@@ -1287,11 +1341,38 @@
               <w:jc w:val="center"/>
             </w:pPr>
             <w:r>
-              <w:rPr>
-                <w:color w:val="A0A0A0"/>
-                <w:sz w:val="15"/>
-              </w:rPr>
-              <w:t>____________________</w:t>
+              <w:drawing>
+                <wp:inline xmlns:a="http://schemas.openxmlformats.org/drawingml/2006/main" xmlns:pic="http://schemas.openxmlformats.org/drawingml/2006/picture">
+                  <wp:extent cx="877824" cy="292608"/>
+                  <wp:docPr id="3" name="Picture 3"/>
+                  <wp:cNvGraphicFramePr>
+                    <a:graphicFrameLocks noChangeAspect="1"/>
+                  </wp:cNvGraphicFramePr>
+                  <a:graphic>
+                    <a:graphicData uri="http://schemas.openxmlformats.org/drawingml/2006/picture">
+                      <pic:pic>
+                        <pic:nvPicPr>
+                          <pic:cNvPr id="0" name="image.png"/>
+                          <pic:cNvPicPr/>
+                        </pic:nvPicPr>
+                        <pic:blipFill>
+                          <a:blip r:embed="rId11"/>
+                          <a:stretch>
+                            <a:fillRect/>
+                          </a:stretch>
+                        </pic:blipFill>
+                        <pic:spPr>
+                          <a:xfrm>
+                            <a:off x="0" y="0"/>
+                            <a:ext cx="877824" cy="292608"/>
+                          </a:xfrm>
+                          <a:prstGeom prst="rect"/>
+                        </pic:spPr>
+                      </pic:pic>
+                    </a:graphicData>
+                  </a:graphic>
+                </wp:inline>
+              </w:drawing>
             </w:r>
           </w:p>
         </w:tc>
@@ -1337,7 +1418,7 @@
                 <w:b/>
                 <w:sz w:val="17"/>
               </w:rPr>
-              <w:t>Hermes Morales</w:t>
+              <w:t>solman rojas solarte</w:t>
             </w:r>
           </w:p>
         </w:tc>
@@ -1360,7 +1441,7 @@
               <w:rPr>
                 <w:sz w:val="17"/>
               </w:rPr>
-              <w:t>1006003970</w:t>
+              <w:t>ELE120201039</w:t>
             </w:r>
           </w:p>
         </w:tc>
@@ -1383,7 +1464,7 @@
               <w:rPr>
                 <w:sz w:val="17"/>
               </w:rPr>
-              <w:t>3204731899</w:t>
+              <w:t>3224823934</w:t>
             </w:r>
           </w:p>
         </w:tc>
@@ -1453,7 +1534,7 @@
                 <w:b/>
                 <w:sz w:val="17"/>
               </w:rPr>
-              <w:t>solman rojas solarte</w:t>
+              <w:t>JUAN ALEXANDER LUGO</w:t>
             </w:r>
           </w:p>
         </w:tc>
@@ -1476,7 +1557,7 @@
               <w:rPr>
                 <w:sz w:val="17"/>
               </w:rPr>
-              <w:t>ELE120201039</w:t>
+              <w:t>83090551</w:t>
             </w:r>
           </w:p>
         </w:tc>
@@ -1499,7 +1580,7 @@
               <w:rPr>
                 <w:sz w:val="17"/>
               </w:rPr>
-              <w:t>3224823934</w:t>
+              <w:t>3127103906</w:t>
             </w:r>
           </w:p>
         </w:tc>
@@ -1519,11 +1600,38 @@
               <w:jc w:val="center"/>
             </w:pPr>
             <w:r>
-              <w:rPr>
-                <w:color w:val="A0A0A0"/>
-                <w:sz w:val="15"/>
-              </w:rPr>
-              <w:t>____________________</w:t>
+              <w:drawing>
+                <wp:inline xmlns:a="http://schemas.openxmlformats.org/drawingml/2006/main" xmlns:pic="http://schemas.openxmlformats.org/drawingml/2006/picture">
+                  <wp:extent cx="809682" cy="292608"/>
+                  <wp:docPr id="4" name="Picture 4"/>
+                  <wp:cNvGraphicFramePr>
+                    <a:graphicFrameLocks noChangeAspect="1"/>
+                  </wp:cNvGraphicFramePr>
+                  <a:graphic>
+                    <a:graphicData uri="http://schemas.openxmlformats.org/drawingml/2006/picture">
+                      <pic:pic>
+                        <pic:nvPicPr>
+                          <pic:cNvPr id="0" name="image.png"/>
+                          <pic:cNvPicPr/>
+                        </pic:nvPicPr>
+                        <pic:blipFill>
+                          <a:blip r:embed="rId12"/>
+                          <a:stretch>
+                            <a:fillRect/>
+                          </a:stretch>
+                        </pic:blipFill>
+                        <pic:spPr>
+                          <a:xfrm>
+                            <a:off x="0" y="0"/>
+                            <a:ext cx="809682" cy="292608"/>
+                          </a:xfrm>
+                          <a:prstGeom prst="rect"/>
+                        </pic:spPr>
+                      </pic:pic>
+                    </a:graphicData>
+                  </a:graphic>
+                </wp:inline>
+              </w:drawing>
             </w:r>
           </w:p>
         </w:tc>
@@ -1569,7 +1677,7 @@
                 <w:b/>
                 <w:sz w:val="17"/>
               </w:rPr>
-              <w:t>JUAN ALEXANDER LUGO</w:t>
+              <w:t>cristian david adamez ceballes</w:t>
             </w:r>
           </w:p>
         </w:tc>
@@ -1592,7 +1700,7 @@
               <w:rPr>
                 <w:sz w:val="17"/>
               </w:rPr>
-              <w:t>83090551</w:t>
+              <w:t>1007163619</w:t>
             </w:r>
           </w:p>
         </w:tc>
@@ -1615,7 +1723,7 @@
               <w:rPr>
                 <w:sz w:val="17"/>
               </w:rPr>
-              <w:t>3127103906</w:t>
+              <w:t>3116307784</w:t>
             </w:r>
           </w:p>
         </w:tc>
@@ -1685,7 +1793,7 @@
                 <w:b/>
                 <w:sz w:val="17"/>
               </w:rPr>
-              <w:t>cristian david adamez ceballes</w:t>
+              <w:t>Karen viviana Gaona Vargas</w:t>
             </w:r>
           </w:p>
         </w:tc>
@@ -1708,7 +1816,7 @@
               <w:rPr>
                 <w:sz w:val="17"/>
               </w:rPr>
-              <w:t>1007163619</w:t>
+              <w:t>1077866338</w:t>
             </w:r>
           </w:p>
         </w:tc>
@@ -1731,7 +1839,7 @@
               <w:rPr>
                 <w:sz w:val="17"/>
               </w:rPr>
-              <w:t>3116307784</w:t>
+              <w:t>3202555302</w:t>
             </w:r>
           </w:p>
         </w:tc>
@@ -1801,7 +1909,7 @@
                 <w:b/>
                 <w:sz w:val="17"/>
               </w:rPr>
-              <w:t>Karen viviana Gaona Vargas</w:t>
+              <w:t>Alvaro Andrés González albañil</w:t>
             </w:r>
           </w:p>
         </w:tc>
@@ -1824,7 +1932,7 @@
               <w:rPr>
                 <w:sz w:val="17"/>
               </w:rPr>
-              <w:t>1077866338</w:t>
+              <w:t>ELE0120242022</w:t>
             </w:r>
           </w:p>
         </w:tc>
@@ -1847,7 +1955,7 @@
               <w:rPr>
                 <w:sz w:val="17"/>
               </w:rPr>
-              <w:t>3202555302</w:t>
+              <w:t>3176543168</w:t>
             </w:r>
           </w:p>
         </w:tc>
@@ -1917,7 +2025,7 @@
                 <w:b/>
                 <w:sz w:val="17"/>
               </w:rPr>
-              <w:t>Alvaro Andrés González albañil</w:t>
+              <w:t>EDWIN CERQUERA</w:t>
             </w:r>
           </w:p>
         </w:tc>
@@ -1940,7 +2048,7 @@
               <w:rPr>
                 <w:sz w:val="17"/>
               </w:rPr>
-              <w:t>ELE0120242022</w:t>
+              <w:t>1079508201</w:t>
             </w:r>
           </w:p>
         </w:tc>
@@ -1963,7 +2071,7 @@
               <w:rPr>
                 <w:sz w:val="17"/>
               </w:rPr>
-              <w:t>3176543168</w:t>
+              <w:t>3185393260</w:t>
             </w:r>
           </w:p>
         </w:tc>
@@ -1988,6 +2096,435 @@
                 <w:sz w:val="15"/>
               </w:rPr>
               <w:t>____________________</w:t>
+            </w:r>
+          </w:p>
+        </w:tc>
+      </w:tr>
+      <w:tr>
+        <w:tc>
+          <w:tcPr>
+            <w:tcW w:type="dxa" w:w="576"/>
+            <w:tcMar>
+              <w:top w:w="100" w:type="dxa"/>
+              <w:bottom w:w="100" w:type="dxa"/>
+              <w:left w:w="80" w:type="dxa"/>
+              <w:right w:w="80" w:type="dxa"/>
+            </w:tcMar>
+            <w:shd w:fill="F9FAF8"/>
+          </w:tcPr>
+          <w:p>
+            <w:pPr>
+              <w:jc w:val="center"/>
+            </w:pPr>
+            <w:r>
+              <w:rPr>
+                <w:sz w:val="17"/>
+              </w:rPr>
+              <w:t>16</w:t>
+            </w:r>
+          </w:p>
+        </w:tc>
+        <w:tc>
+          <w:tcPr>
+            <w:tcW w:type="dxa" w:w="3312"/>
+            <w:tcMar>
+              <w:top w:w="100" w:type="dxa"/>
+              <w:bottom w:w="100" w:type="dxa"/>
+              <w:left w:w="80" w:type="dxa"/>
+              <w:right w:w="80" w:type="dxa"/>
+            </w:tcMar>
+            <w:shd w:fill="F9FAF8"/>
+          </w:tcPr>
+          <w:p>
+            <w:r>
+              <w:rPr>
+                <w:b/>
+                <w:sz w:val="17"/>
+              </w:rPr>
+              <w:t>Juan Sebastian Jaramillo romero</w:t>
+            </w:r>
+          </w:p>
+        </w:tc>
+        <w:tc>
+          <w:tcPr>
+            <w:tcW w:type="dxa" w:w="1728"/>
+            <w:tcMar>
+              <w:top w:w="100" w:type="dxa"/>
+              <w:bottom w:w="100" w:type="dxa"/>
+              <w:left w:w="80" w:type="dxa"/>
+              <w:right w:w="80" w:type="dxa"/>
+            </w:tcMar>
+            <w:shd w:fill="F9FAF8"/>
+          </w:tcPr>
+          <w:p>
+            <w:pPr>
+              <w:jc w:val="center"/>
+            </w:pPr>
+            <w:r>
+              <w:rPr>
+                <w:sz w:val="17"/>
+              </w:rPr>
+              <w:t>1110552017</w:t>
+            </w:r>
+          </w:p>
+        </w:tc>
+        <w:tc>
+          <w:tcPr>
+            <w:tcW w:type="dxa" w:w="1584"/>
+            <w:tcMar>
+              <w:top w:w="100" w:type="dxa"/>
+              <w:bottom w:w="100" w:type="dxa"/>
+              <w:left w:w="80" w:type="dxa"/>
+              <w:right w:w="80" w:type="dxa"/>
+            </w:tcMar>
+            <w:shd w:fill="F9FAF8"/>
+          </w:tcPr>
+          <w:p>
+            <w:pPr>
+              <w:jc w:val="center"/>
+            </w:pPr>
+            <w:r>
+              <w:rPr>
+                <w:sz w:val="17"/>
+              </w:rPr>
+              <w:t>3168512676</w:t>
+            </w:r>
+          </w:p>
+        </w:tc>
+        <w:tc>
+          <w:tcPr>
+            <w:tcW w:type="dxa" w:w="2592"/>
+            <w:tcMar>
+              <w:top w:w="100" w:type="dxa"/>
+              <w:bottom w:w="100" w:type="dxa"/>
+              <w:left w:w="80" w:type="dxa"/>
+              <w:right w:w="80" w:type="dxa"/>
+            </w:tcMar>
+            <w:shd w:fill="F9FAF8"/>
+          </w:tcPr>
+          <w:p>
+            <w:pPr>
+              <w:jc w:val="center"/>
+            </w:pPr>
+            <w:r>
+              <w:drawing>
+                <wp:inline xmlns:a="http://schemas.openxmlformats.org/drawingml/2006/main" xmlns:pic="http://schemas.openxmlformats.org/drawingml/2006/picture">
+                  <wp:extent cx="1366360" cy="292608"/>
+                  <wp:docPr id="5" name="Picture 5"/>
+                  <wp:cNvGraphicFramePr>
+                    <a:graphicFrameLocks noChangeAspect="1"/>
+                  </wp:cNvGraphicFramePr>
+                  <a:graphic>
+                    <a:graphicData uri="http://schemas.openxmlformats.org/drawingml/2006/picture">
+                      <pic:pic>
+                        <pic:nvPicPr>
+                          <pic:cNvPr id="0" name="image.png"/>
+                          <pic:cNvPicPr/>
+                        </pic:nvPicPr>
+                        <pic:blipFill>
+                          <a:blip r:embed="rId13"/>
+                          <a:stretch>
+                            <a:fillRect/>
+                          </a:stretch>
+                        </pic:blipFill>
+                        <pic:spPr>
+                          <a:xfrm>
+                            <a:off x="0" y="0"/>
+                            <a:ext cx="1366360" cy="292608"/>
+                          </a:xfrm>
+                          <a:prstGeom prst="rect"/>
+                        </pic:spPr>
+                      </pic:pic>
+                    </a:graphicData>
+                  </a:graphic>
+                </wp:inline>
+              </w:drawing>
+            </w:r>
+          </w:p>
+        </w:tc>
+      </w:tr>
+      <w:tr>
+        <w:tc>
+          <w:tcPr>
+            <w:tcW w:type="dxa" w:w="576"/>
+            <w:tcMar>
+              <w:top w:w="100" w:type="dxa"/>
+              <w:bottom w:w="100" w:type="dxa"/>
+              <w:left w:w="80" w:type="dxa"/>
+              <w:right w:w="80" w:type="dxa"/>
+            </w:tcMar>
+            <w:shd w:fill="FFFFFF"/>
+          </w:tcPr>
+          <w:p>
+            <w:pPr>
+              <w:jc w:val="center"/>
+            </w:pPr>
+            <w:r>
+              <w:rPr>
+                <w:sz w:val="17"/>
+              </w:rPr>
+              <w:t>17</w:t>
+            </w:r>
+          </w:p>
+        </w:tc>
+        <w:tc>
+          <w:tcPr>
+            <w:tcW w:type="dxa" w:w="3312"/>
+            <w:tcMar>
+              <w:top w:w="100" w:type="dxa"/>
+              <w:bottom w:w="100" w:type="dxa"/>
+              <w:left w:w="80" w:type="dxa"/>
+              <w:right w:w="80" w:type="dxa"/>
+            </w:tcMar>
+            <w:shd w:fill="FFFFFF"/>
+          </w:tcPr>
+          <w:p>
+            <w:r>
+              <w:rPr>
+                <w:b/>
+                <w:sz w:val="17"/>
+              </w:rPr>
+              <w:t>Luis Enrique Quevedo Rojas</w:t>
+            </w:r>
+          </w:p>
+        </w:tc>
+        <w:tc>
+          <w:tcPr>
+            <w:tcW w:type="dxa" w:w="1728"/>
+            <w:tcMar>
+              <w:top w:w="100" w:type="dxa"/>
+              <w:bottom w:w="100" w:type="dxa"/>
+              <w:left w:w="80" w:type="dxa"/>
+              <w:right w:w="80" w:type="dxa"/>
+            </w:tcMar>
+            <w:shd w:fill="FFFFFF"/>
+          </w:tcPr>
+          <w:p>
+            <w:pPr>
+              <w:jc w:val="center"/>
+            </w:pPr>
+            <w:r>
+              <w:rPr>
+                <w:sz w:val="17"/>
+              </w:rPr>
+              <w:t>1075208119</w:t>
+            </w:r>
+          </w:p>
+        </w:tc>
+        <w:tc>
+          <w:tcPr>
+            <w:tcW w:type="dxa" w:w="1584"/>
+            <w:tcMar>
+              <w:top w:w="100" w:type="dxa"/>
+              <w:bottom w:w="100" w:type="dxa"/>
+              <w:left w:w="80" w:type="dxa"/>
+              <w:right w:w="80" w:type="dxa"/>
+            </w:tcMar>
+            <w:shd w:fill="FFFFFF"/>
+          </w:tcPr>
+          <w:p>
+            <w:pPr>
+              <w:jc w:val="center"/>
+            </w:pPr>
+            <w:r>
+              <w:rPr>
+                <w:sz w:val="17"/>
+              </w:rPr>
+              <w:t>3157056179</w:t>
+            </w:r>
+          </w:p>
+        </w:tc>
+        <w:tc>
+          <w:tcPr>
+            <w:tcW w:type="dxa" w:w="2592"/>
+            <w:tcMar>
+              <w:top w:w="100" w:type="dxa"/>
+              <w:bottom w:w="100" w:type="dxa"/>
+              <w:left w:w="80" w:type="dxa"/>
+              <w:right w:w="80" w:type="dxa"/>
+            </w:tcMar>
+            <w:shd w:fill="FFFFFF"/>
+          </w:tcPr>
+          <w:p>
+            <w:pPr>
+              <w:jc w:val="center"/>
+            </w:pPr>
+            <w:r>
+              <w:drawing>
+                <wp:inline xmlns:a="http://schemas.openxmlformats.org/drawingml/2006/main" xmlns:pic="http://schemas.openxmlformats.org/drawingml/2006/picture">
+                  <wp:extent cx="813749" cy="292608"/>
+                  <wp:docPr id="6" name="Picture 6"/>
+                  <wp:cNvGraphicFramePr>
+                    <a:graphicFrameLocks noChangeAspect="1"/>
+                  </wp:cNvGraphicFramePr>
+                  <a:graphic>
+                    <a:graphicData uri="http://schemas.openxmlformats.org/drawingml/2006/picture">
+                      <pic:pic>
+                        <pic:nvPicPr>
+                          <pic:cNvPr id="0" name="image.png"/>
+                          <pic:cNvPicPr/>
+                        </pic:nvPicPr>
+                        <pic:blipFill>
+                          <a:blip r:embed="rId14"/>
+                          <a:stretch>
+                            <a:fillRect/>
+                          </a:stretch>
+                        </pic:blipFill>
+                        <pic:spPr>
+                          <a:xfrm>
+                            <a:off x="0" y="0"/>
+                            <a:ext cx="813749" cy="292608"/>
+                          </a:xfrm>
+                          <a:prstGeom prst="rect"/>
+                        </pic:spPr>
+                      </pic:pic>
+                    </a:graphicData>
+                  </a:graphic>
+                </wp:inline>
+              </w:drawing>
+            </w:r>
+          </w:p>
+        </w:tc>
+      </w:tr>
+      <w:tr>
+        <w:tc>
+          <w:tcPr>
+            <w:tcW w:type="dxa" w:w="576"/>
+            <w:tcMar>
+              <w:top w:w="100" w:type="dxa"/>
+              <w:bottom w:w="100" w:type="dxa"/>
+              <w:left w:w="80" w:type="dxa"/>
+              <w:right w:w="80" w:type="dxa"/>
+            </w:tcMar>
+            <w:shd w:fill="F9FAF8"/>
+          </w:tcPr>
+          <w:p>
+            <w:pPr>
+              <w:jc w:val="center"/>
+            </w:pPr>
+            <w:r>
+              <w:rPr>
+                <w:sz w:val="17"/>
+              </w:rPr>
+              <w:t>18</w:t>
+            </w:r>
+          </w:p>
+        </w:tc>
+        <w:tc>
+          <w:tcPr>
+            <w:tcW w:type="dxa" w:w="3312"/>
+            <w:tcMar>
+              <w:top w:w="100" w:type="dxa"/>
+              <w:bottom w:w="100" w:type="dxa"/>
+              <w:left w:w="80" w:type="dxa"/>
+              <w:right w:w="80" w:type="dxa"/>
+            </w:tcMar>
+            <w:shd w:fill="F9FAF8"/>
+          </w:tcPr>
+          <w:p>
+            <w:r>
+              <w:rPr>
+                <w:b/>
+                <w:sz w:val="17"/>
+              </w:rPr>
+              <w:t>John jairo Sánchez garcia</w:t>
+            </w:r>
+          </w:p>
+        </w:tc>
+        <w:tc>
+          <w:tcPr>
+            <w:tcW w:type="dxa" w:w="1728"/>
+            <w:tcMar>
+              <w:top w:w="100" w:type="dxa"/>
+              <w:bottom w:w="100" w:type="dxa"/>
+              <w:left w:w="80" w:type="dxa"/>
+              <w:right w:w="80" w:type="dxa"/>
+            </w:tcMar>
+            <w:shd w:fill="F9FAF8"/>
+          </w:tcPr>
+          <w:p>
+            <w:pPr>
+              <w:jc w:val="center"/>
+            </w:pPr>
+            <w:r>
+              <w:rPr>
+                <w:sz w:val="17"/>
+              </w:rPr>
+              <w:t>79843323</w:t>
+            </w:r>
+          </w:p>
+        </w:tc>
+        <w:tc>
+          <w:tcPr>
+            <w:tcW w:type="dxa" w:w="1584"/>
+            <w:tcMar>
+              <w:top w:w="100" w:type="dxa"/>
+              <w:bottom w:w="100" w:type="dxa"/>
+              <w:left w:w="80" w:type="dxa"/>
+              <w:right w:w="80" w:type="dxa"/>
+            </w:tcMar>
+            <w:shd w:fill="F9FAF8"/>
+          </w:tcPr>
+          <w:p>
+            <w:pPr>
+              <w:jc w:val="center"/>
+            </w:pPr>
+            <w:r>
+              <w:rPr>
+                <w:sz w:val="17"/>
+              </w:rPr>
+              <w:t>3108505201</w:t>
+            </w:r>
+          </w:p>
+        </w:tc>
+        <w:tc>
+          <w:tcPr>
+            <w:tcW w:type="dxa" w:w="2592"/>
+            <w:tcMar>
+              <w:top w:w="100" w:type="dxa"/>
+              <w:bottom w:w="100" w:type="dxa"/>
+              <w:left w:w="80" w:type="dxa"/>
+              <w:right w:w="80" w:type="dxa"/>
+            </w:tcMar>
+            <w:shd w:fill="F9FAF8"/>
+          </w:tcPr>
+          <w:p>
+            <w:pPr>
+              <w:jc w:val="center"/>
+            </w:pPr>
+            <w:r>
+              <w:drawing>
+                <wp:inline xmlns:a="http://schemas.openxmlformats.org/drawingml/2006/main" xmlns:pic="http://schemas.openxmlformats.org/drawingml/2006/picture">
+                  <wp:extent cx="1370333" cy="292608"/>
+                  <wp:docPr id="7" name="Picture 7"/>
+                  <wp:cNvGraphicFramePr>
+                    <a:graphicFrameLocks noChangeAspect="1"/>
+                  </wp:cNvGraphicFramePr>
+                  <a:graphic>
+                    <a:graphicData uri="http://schemas.openxmlformats.org/drawingml/2006/picture">
+                      <pic:pic>
+                        <pic:nvPicPr>
+                          <pic:cNvPr id="0" name="image.png"/>
+                          <pic:cNvPicPr/>
+                        </pic:nvPicPr>
+                        <pic:blipFill>
+                          <a:blip r:embed="rId15"/>
+                          <a:stretch>
+                            <a:fillRect/>
+                          </a:stretch>
+                        </pic:blipFill>
+                        <pic:spPr>
+                          <a:xfrm>
+                            <a:off x="0" y="0"/>
+                            <a:ext cx="1370333" cy="292608"/>
+                          </a:xfrm>
+                          <a:prstGeom prst="rect"/>
+                        </pic:spPr>
+                      </pic:pic>
+                    </a:graphicData>
+                  </a:graphic>
+                </wp:inline>
+              </w:drawing>
             </w:r>
           </w:p>
         </w:tc>

</xml_diff>

<commit_message>
chore(auto): actualizar cartas con 64 estudiantes y 21 firmas [2026-10-22 22:54]
</commit_message>
<xml_diff>
--- a/cartas_solicitud/Carta_Solicitud_ELE0300116_ELECTIVA_III-MATEMATICA_FINANCIERA.docx
+++ b/cartas_solicitud/Carta_Solicitud_ELE0300116_ELECTIVA_III-MATEMATICA_FINANCIERA.docx
@@ -966,11 +966,38 @@
               <w:jc w:val="center"/>
             </w:pPr>
             <w:r>
-              <w:rPr>
-                <w:color w:val="A0A0A0"/>
-                <w:sz w:val="15"/>
-              </w:rPr>
-              <w:t>____________________</w:t>
+              <w:drawing>
+                <wp:inline xmlns:a="http://schemas.openxmlformats.org/drawingml/2006/main" xmlns:pic="http://schemas.openxmlformats.org/drawingml/2006/picture">
+                  <wp:extent cx="543415" cy="292608"/>
+                  <wp:docPr id="2" name="Picture 2"/>
+                  <wp:cNvGraphicFramePr>
+                    <a:graphicFrameLocks noChangeAspect="1"/>
+                  </wp:cNvGraphicFramePr>
+                  <a:graphic>
+                    <a:graphicData uri="http://schemas.openxmlformats.org/drawingml/2006/picture">
+                      <pic:pic>
+                        <pic:nvPicPr>
+                          <pic:cNvPr id="0" name="image.png"/>
+                          <pic:cNvPicPr/>
+                        </pic:nvPicPr>
+                        <pic:blipFill>
+                          <a:blip r:embed="rId10"/>
+                          <a:stretch>
+                            <a:fillRect/>
+                          </a:stretch>
+                        </pic:blipFill>
+                        <pic:spPr>
+                          <a:xfrm>
+                            <a:off x="0" y="0"/>
+                            <a:ext cx="543415" cy="292608"/>
+                          </a:xfrm>
+                          <a:prstGeom prst="rect"/>
+                        </pic:spPr>
+                      </pic:pic>
+                    </a:graphicData>
+                  </a:graphic>
+                </wp:inline>
+              </w:drawing>
             </w:r>
           </w:p>
         </w:tc>
@@ -1201,7 +1228,7 @@
               <w:drawing>
                 <wp:inline xmlns:a="http://schemas.openxmlformats.org/drawingml/2006/main" xmlns:pic="http://schemas.openxmlformats.org/drawingml/2006/picture">
                   <wp:extent cx="875538" cy="292608"/>
-                  <wp:docPr id="2" name="Picture 2"/>
+                  <wp:docPr id="3" name="Picture 3"/>
                   <wp:cNvGraphicFramePr>
                     <a:graphicFrameLocks noChangeAspect="1"/>
                   </wp:cNvGraphicFramePr>
@@ -1213,7 +1240,7 @@
                           <pic:cNvPicPr/>
                         </pic:nvPicPr>
                         <pic:blipFill>
-                          <a:blip r:embed="rId10"/>
+                          <a:blip r:embed="rId11"/>
                           <a:stretch>
                             <a:fillRect/>
                           </a:stretch>
@@ -1344,7 +1371,7 @@
               <w:drawing>
                 <wp:inline xmlns:a="http://schemas.openxmlformats.org/drawingml/2006/main" xmlns:pic="http://schemas.openxmlformats.org/drawingml/2006/picture">
                   <wp:extent cx="877824" cy="292608"/>
-                  <wp:docPr id="3" name="Picture 3"/>
+                  <wp:docPr id="4" name="Picture 4"/>
                   <wp:cNvGraphicFramePr>
                     <a:graphicFrameLocks noChangeAspect="1"/>
                   </wp:cNvGraphicFramePr>
@@ -1356,7 +1383,7 @@
                           <pic:cNvPicPr/>
                         </pic:nvPicPr>
                         <pic:blipFill>
-                          <a:blip r:embed="rId11"/>
+                          <a:blip r:embed="rId12"/>
                           <a:stretch>
                             <a:fillRect/>
                           </a:stretch>
@@ -1603,7 +1630,7 @@
               <w:drawing>
                 <wp:inline xmlns:a="http://schemas.openxmlformats.org/drawingml/2006/main" xmlns:pic="http://schemas.openxmlformats.org/drawingml/2006/picture">
                   <wp:extent cx="809682" cy="292608"/>
-                  <wp:docPr id="4" name="Picture 4"/>
+                  <wp:docPr id="5" name="Picture 5"/>
                   <wp:cNvGraphicFramePr>
                     <a:graphicFrameLocks noChangeAspect="1"/>
                   </wp:cNvGraphicFramePr>
@@ -1615,7 +1642,7 @@
                           <pic:cNvPicPr/>
                         </pic:nvPicPr>
                         <pic:blipFill>
-                          <a:blip r:embed="rId12"/>
+                          <a:blip r:embed="rId13"/>
                           <a:stretch>
                             <a:fillRect/>
                           </a:stretch>
@@ -2210,7 +2237,7 @@
               <w:drawing>
                 <wp:inline xmlns:a="http://schemas.openxmlformats.org/drawingml/2006/main" xmlns:pic="http://schemas.openxmlformats.org/drawingml/2006/picture">
                   <wp:extent cx="1366360" cy="292608"/>
-                  <wp:docPr id="5" name="Picture 5"/>
+                  <wp:docPr id="6" name="Picture 6"/>
                   <wp:cNvGraphicFramePr>
                     <a:graphicFrameLocks noChangeAspect="1"/>
                   </wp:cNvGraphicFramePr>
@@ -2222,7 +2249,7 @@
                           <pic:cNvPicPr/>
                         </pic:nvPicPr>
                         <pic:blipFill>
-                          <a:blip r:embed="rId13"/>
+                          <a:blip r:embed="rId14"/>
                           <a:stretch>
                             <a:fillRect/>
                           </a:stretch>
@@ -2353,7 +2380,7 @@
               <w:drawing>
                 <wp:inline xmlns:a="http://schemas.openxmlformats.org/drawingml/2006/main" xmlns:pic="http://schemas.openxmlformats.org/drawingml/2006/picture">
                   <wp:extent cx="813749" cy="292608"/>
-                  <wp:docPr id="6" name="Picture 6"/>
+                  <wp:docPr id="7" name="Picture 7"/>
                   <wp:cNvGraphicFramePr>
                     <a:graphicFrameLocks noChangeAspect="1"/>
                   </wp:cNvGraphicFramePr>
@@ -2365,7 +2392,7 @@
                           <pic:cNvPicPr/>
                         </pic:nvPicPr>
                         <pic:blipFill>
-                          <a:blip r:embed="rId14"/>
+                          <a:blip r:embed="rId15"/>
                           <a:stretch>
                             <a:fillRect/>
                           </a:stretch>
@@ -2496,7 +2523,7 @@
               <w:drawing>
                 <wp:inline xmlns:a="http://schemas.openxmlformats.org/drawingml/2006/main" xmlns:pic="http://schemas.openxmlformats.org/drawingml/2006/picture">
                   <wp:extent cx="1370333" cy="292608"/>
-                  <wp:docPr id="7" name="Picture 7"/>
+                  <wp:docPr id="8" name="Picture 8"/>
                   <wp:cNvGraphicFramePr>
                     <a:graphicFrameLocks noChangeAspect="1"/>
                   </wp:cNvGraphicFramePr>
@@ -2508,7 +2535,7 @@
                           <pic:cNvPicPr/>
                         </pic:nvPicPr>
                         <pic:blipFill>
-                          <a:blip r:embed="rId15"/>
+                          <a:blip r:embed="rId16"/>
                           <a:stretch>
                             <a:fillRect/>
                           </a:stretch>

</xml_diff>

<commit_message>
chore(auto): actualizar cartas con 73 estudiantes y 46 firmas [2026-10-24 15:50]
</commit_message>
<xml_diff>
--- a/cartas_solicitud/Carta_Solicitud_ELE0300116_ELECTIVA_III-MATEMATICA_FINANCIERA.docx
+++ b/cartas_solicitud/Carta_Solicitud_ELE0300116_ELECTIVA_III-MATEMATICA_FINANCIERA.docx
@@ -88,7 +88,7 @@
         <w:br/>
         <w:t>• Semestre del Plan de Estudios: Semestre 9°</w:t>
         <w:br/>
-        <w:t>• Total de Estudiantes Solicitantes Preinscritos: 18 estudiantes</w:t>
+        <w:t>• Total de Estudiantes Solicitantes Preinscritos: 20 estudiantes</w:t>
       </w:r>
     </w:p>
     <w:p>
@@ -97,7 +97,7 @@
         <w:jc w:val="both"/>
       </w:pPr>
       <w:r>
-        <w:t>Manifestamos nuestro compromiso formal de matrícula y cumplimiento con los requerimientos académicos y arancelarios correspondientes al curso vacacional. Dado que contamos con un grupo sólido de 18 estudiantes interesados (superando el cupo mínimo requerido de 10 estudiantes), solicitamos su valiosa gestión ante la Coordinación Académica y la Dirección de Programa para su respectiva aprobación, asignación docente y programación de horarios.</w:t>
+        <w:t>Manifestamos nuestro compromiso formal de matrícula y cumplimiento con los requerimientos académicos y arancelarios correspondientes al curso vacacional. Dado que contamos con un grupo sólido de 20 estudiantes interesados (superando el cupo mínimo requerido de 10 estudiantes), solicitamos su valiosa gestión ante la Coordinación Académica y la Dirección de Programa para su respectiva aprobación, asignación docente y programación de horarios.</w:t>
       </w:r>
     </w:p>
     <w:p>
@@ -734,11 +734,38 @@
               <w:jc w:val="center"/>
             </w:pPr>
             <w:r>
-              <w:rPr>
-                <w:color w:val="A0A0A0"/>
-                <w:sz w:val="15"/>
-              </w:rPr>
-              <w:t>____________________</w:t>
+              <w:drawing>
+                <wp:inline xmlns:a="http://schemas.openxmlformats.org/drawingml/2006/main" xmlns:pic="http://schemas.openxmlformats.org/drawingml/2006/picture">
+                  <wp:extent cx="731520" cy="292608"/>
+                  <wp:docPr id="2" name="Picture 2"/>
+                  <wp:cNvGraphicFramePr>
+                    <a:graphicFrameLocks noChangeAspect="1"/>
+                  </wp:cNvGraphicFramePr>
+                  <a:graphic>
+                    <a:graphicData uri="http://schemas.openxmlformats.org/drawingml/2006/picture">
+                      <pic:pic>
+                        <pic:nvPicPr>
+                          <pic:cNvPr id="0" name="image.png"/>
+                          <pic:cNvPicPr/>
+                        </pic:nvPicPr>
+                        <pic:blipFill>
+                          <a:blip r:embed="rId10"/>
+                          <a:stretch>
+                            <a:fillRect/>
+                          </a:stretch>
+                        </pic:blipFill>
+                        <pic:spPr>
+                          <a:xfrm>
+                            <a:off x="0" y="0"/>
+                            <a:ext cx="731520" cy="292608"/>
+                          </a:xfrm>
+                          <a:prstGeom prst="rect"/>
+                        </pic:spPr>
+                      </pic:pic>
+                    </a:graphicData>
+                  </a:graphic>
+                </wp:inline>
+              </w:drawing>
             </w:r>
           </w:p>
         </w:tc>
@@ -969,7 +996,7 @@
               <w:drawing>
                 <wp:inline xmlns:a="http://schemas.openxmlformats.org/drawingml/2006/main" xmlns:pic="http://schemas.openxmlformats.org/drawingml/2006/picture">
                   <wp:extent cx="543415" cy="292608"/>
-                  <wp:docPr id="2" name="Picture 2"/>
+                  <wp:docPr id="3" name="Picture 3"/>
                   <wp:cNvGraphicFramePr>
                     <a:graphicFrameLocks noChangeAspect="1"/>
                   </wp:cNvGraphicFramePr>
@@ -981,7 +1008,7 @@
                           <pic:cNvPicPr/>
                         </pic:nvPicPr>
                         <pic:blipFill>
-                          <a:blip r:embed="rId10"/>
+                          <a:blip r:embed="rId11"/>
                           <a:stretch>
                             <a:fillRect/>
                           </a:stretch>
@@ -1109,11 +1136,38 @@
               <w:jc w:val="center"/>
             </w:pPr>
             <w:r>
-              <w:rPr>
-                <w:color w:val="A0A0A0"/>
-                <w:sz w:val="15"/>
-              </w:rPr>
-              <w:t>____________________</w:t>
+              <w:drawing>
+                <wp:inline xmlns:a="http://schemas.openxmlformats.org/drawingml/2006/main" xmlns:pic="http://schemas.openxmlformats.org/drawingml/2006/picture">
+                  <wp:extent cx="731520" cy="292608"/>
+                  <wp:docPr id="4" name="Picture 4"/>
+                  <wp:cNvGraphicFramePr>
+                    <a:graphicFrameLocks noChangeAspect="1"/>
+                  </wp:cNvGraphicFramePr>
+                  <a:graphic>
+                    <a:graphicData uri="http://schemas.openxmlformats.org/drawingml/2006/picture">
+                      <pic:pic>
+                        <pic:nvPicPr>
+                          <pic:cNvPr id="0" name="image.png"/>
+                          <pic:cNvPicPr/>
+                        </pic:nvPicPr>
+                        <pic:blipFill>
+                          <a:blip r:embed="rId12"/>
+                          <a:stretch>
+                            <a:fillRect/>
+                          </a:stretch>
+                        </pic:blipFill>
+                        <pic:spPr>
+                          <a:xfrm>
+                            <a:off x="0" y="0"/>
+                            <a:ext cx="731520" cy="292608"/>
+                          </a:xfrm>
+                          <a:prstGeom prst="rect"/>
+                        </pic:spPr>
+                      </pic:pic>
+                    </a:graphicData>
+                  </a:graphic>
+                </wp:inline>
+              </w:drawing>
             </w:r>
           </w:p>
         </w:tc>
@@ -1228,7 +1282,7 @@
               <w:drawing>
                 <wp:inline xmlns:a="http://schemas.openxmlformats.org/drawingml/2006/main" xmlns:pic="http://schemas.openxmlformats.org/drawingml/2006/picture">
                   <wp:extent cx="875538" cy="292608"/>
-                  <wp:docPr id="3" name="Picture 3"/>
+                  <wp:docPr id="5" name="Picture 5"/>
                   <wp:cNvGraphicFramePr>
                     <a:graphicFrameLocks noChangeAspect="1"/>
                   </wp:cNvGraphicFramePr>
@@ -1240,7 +1294,7 @@
                           <pic:cNvPicPr/>
                         </pic:nvPicPr>
                         <pic:blipFill>
-                          <a:blip r:embed="rId11"/>
+                          <a:blip r:embed="rId13"/>
                           <a:stretch>
                             <a:fillRect/>
                           </a:stretch>
@@ -1371,7 +1425,7 @@
               <w:drawing>
                 <wp:inline xmlns:a="http://schemas.openxmlformats.org/drawingml/2006/main" xmlns:pic="http://schemas.openxmlformats.org/drawingml/2006/picture">
                   <wp:extent cx="877824" cy="292608"/>
-                  <wp:docPr id="4" name="Picture 4"/>
+                  <wp:docPr id="6" name="Picture 6"/>
                   <wp:cNvGraphicFramePr>
                     <a:graphicFrameLocks noChangeAspect="1"/>
                   </wp:cNvGraphicFramePr>
@@ -1383,7 +1437,7 @@
                           <pic:cNvPicPr/>
                         </pic:nvPicPr>
                         <pic:blipFill>
-                          <a:blip r:embed="rId12"/>
+                          <a:blip r:embed="rId14"/>
                           <a:stretch>
                             <a:fillRect/>
                           </a:stretch>
@@ -1511,11 +1565,38 @@
               <w:jc w:val="center"/>
             </w:pPr>
             <w:r>
-              <w:rPr>
-                <w:color w:val="A0A0A0"/>
-                <w:sz w:val="15"/>
-              </w:rPr>
-              <w:t>____________________</w:t>
+              <w:drawing>
+                <wp:inline xmlns:a="http://schemas.openxmlformats.org/drawingml/2006/main" xmlns:pic="http://schemas.openxmlformats.org/drawingml/2006/picture">
+                  <wp:extent cx="731520" cy="292608"/>
+                  <wp:docPr id="7" name="Picture 7"/>
+                  <wp:cNvGraphicFramePr>
+                    <a:graphicFrameLocks noChangeAspect="1"/>
+                  </wp:cNvGraphicFramePr>
+                  <a:graphic>
+                    <a:graphicData uri="http://schemas.openxmlformats.org/drawingml/2006/picture">
+                      <pic:pic>
+                        <pic:nvPicPr>
+                          <pic:cNvPr id="0" name="image.png"/>
+                          <pic:cNvPicPr/>
+                        </pic:nvPicPr>
+                        <pic:blipFill>
+                          <a:blip r:embed="rId15"/>
+                          <a:stretch>
+                            <a:fillRect/>
+                          </a:stretch>
+                        </pic:blipFill>
+                        <pic:spPr>
+                          <a:xfrm>
+                            <a:off x="0" y="0"/>
+                            <a:ext cx="731520" cy="292608"/>
+                          </a:xfrm>
+                          <a:prstGeom prst="rect"/>
+                        </pic:spPr>
+                      </pic:pic>
+                    </a:graphicData>
+                  </a:graphic>
+                </wp:inline>
+              </w:drawing>
             </w:r>
           </w:p>
         </w:tc>
@@ -1630,7 +1711,7 @@
               <w:drawing>
                 <wp:inline xmlns:a="http://schemas.openxmlformats.org/drawingml/2006/main" xmlns:pic="http://schemas.openxmlformats.org/drawingml/2006/picture">
                   <wp:extent cx="809682" cy="292608"/>
-                  <wp:docPr id="5" name="Picture 5"/>
+                  <wp:docPr id="8" name="Picture 8"/>
                   <wp:cNvGraphicFramePr>
                     <a:graphicFrameLocks noChangeAspect="1"/>
                   </wp:cNvGraphicFramePr>
@@ -1642,7 +1723,7 @@
                           <pic:cNvPicPr/>
                         </pic:nvPicPr>
                         <pic:blipFill>
-                          <a:blip r:embed="rId13"/>
+                          <a:blip r:embed="rId16"/>
                           <a:stretch>
                             <a:fillRect/>
                           </a:stretch>
@@ -1704,7 +1785,7 @@
                 <w:b/>
                 <w:sz w:val="17"/>
               </w:rPr>
-              <w:t>cristian david adamez ceballes</w:t>
+              <w:t>Karen viviana Gaona Vargas</w:t>
             </w:r>
           </w:p>
         </w:tc>
@@ -1727,7 +1808,7 @@
               <w:rPr>
                 <w:sz w:val="17"/>
               </w:rPr>
-              <w:t>1007163619</w:t>
+              <w:t>1077866338</w:t>
             </w:r>
           </w:p>
         </w:tc>
@@ -1750,7 +1831,7 @@
               <w:rPr>
                 <w:sz w:val="17"/>
               </w:rPr>
-              <w:t>3116307784</w:t>
+              <w:t>3202555302</w:t>
             </w:r>
           </w:p>
         </w:tc>
@@ -1820,7 +1901,7 @@
                 <w:b/>
                 <w:sz w:val="17"/>
               </w:rPr>
-              <w:t>Karen viviana Gaona Vargas</w:t>
+              <w:t>Alvaro Andrés González albañil</w:t>
             </w:r>
           </w:p>
         </w:tc>
@@ -1843,7 +1924,7 @@
               <w:rPr>
                 <w:sz w:val="17"/>
               </w:rPr>
-              <w:t>1077866338</w:t>
+              <w:t>ELE0120242022</w:t>
             </w:r>
           </w:p>
         </w:tc>
@@ -1866,7 +1947,7 @@
               <w:rPr>
                 <w:sz w:val="17"/>
               </w:rPr>
-              <w:t>3202555302</w:t>
+              <w:t>3176543168</w:t>
             </w:r>
           </w:p>
         </w:tc>
@@ -1886,11 +1967,38 @@
               <w:jc w:val="center"/>
             </w:pPr>
             <w:r>
-              <w:rPr>
-                <w:color w:val="A0A0A0"/>
-                <w:sz w:val="15"/>
-              </w:rPr>
-              <w:t>____________________</w:t>
+              <w:drawing>
+                <wp:inline xmlns:a="http://schemas.openxmlformats.org/drawingml/2006/main" xmlns:pic="http://schemas.openxmlformats.org/drawingml/2006/picture">
+                  <wp:extent cx="731520" cy="292608"/>
+                  <wp:docPr id="9" name="Picture 9"/>
+                  <wp:cNvGraphicFramePr>
+                    <a:graphicFrameLocks noChangeAspect="1"/>
+                  </wp:cNvGraphicFramePr>
+                  <a:graphic>
+                    <a:graphicData uri="http://schemas.openxmlformats.org/drawingml/2006/picture">
+                      <pic:pic>
+                        <pic:nvPicPr>
+                          <pic:cNvPr id="0" name="image.png"/>
+                          <pic:cNvPicPr/>
+                        </pic:nvPicPr>
+                        <pic:blipFill>
+                          <a:blip r:embed="rId17"/>
+                          <a:stretch>
+                            <a:fillRect/>
+                          </a:stretch>
+                        </pic:blipFill>
+                        <pic:spPr>
+                          <a:xfrm>
+                            <a:off x="0" y="0"/>
+                            <a:ext cx="731520" cy="292608"/>
+                          </a:xfrm>
+                          <a:prstGeom prst="rect"/>
+                        </pic:spPr>
+                      </pic:pic>
+                    </a:graphicData>
+                  </a:graphic>
+                </wp:inline>
+              </w:drawing>
             </w:r>
           </w:p>
         </w:tc>
@@ -1936,7 +2044,7 @@
                 <w:b/>
                 <w:sz w:val="17"/>
               </w:rPr>
-              <w:t>Alvaro Andrés González albañil</w:t>
+              <w:t>EDWIN CERQUERA</w:t>
             </w:r>
           </w:p>
         </w:tc>
@@ -1959,7 +2067,7 @@
               <w:rPr>
                 <w:sz w:val="17"/>
               </w:rPr>
-              <w:t>ELE0120242022</w:t>
+              <w:t>1079508201</w:t>
             </w:r>
           </w:p>
         </w:tc>
@@ -1982,7 +2090,7 @@
               <w:rPr>
                 <w:sz w:val="17"/>
               </w:rPr>
-              <w:t>3176543168</w:t>
+              <w:t>3185393260</w:t>
             </w:r>
           </w:p>
         </w:tc>
@@ -2052,7 +2160,7 @@
                 <w:b/>
                 <w:sz w:val="17"/>
               </w:rPr>
-              <w:t>EDWIN CERQUERA</w:t>
+              <w:t>Juan Sebastian Jaramillo romero</w:t>
             </w:r>
           </w:p>
         </w:tc>
@@ -2075,7 +2183,7 @@
               <w:rPr>
                 <w:sz w:val="17"/>
               </w:rPr>
-              <w:t>1079508201</w:t>
+              <w:t>1110552017</w:t>
             </w:r>
           </w:p>
         </w:tc>
@@ -2098,7 +2206,7 @@
               <w:rPr>
                 <w:sz w:val="17"/>
               </w:rPr>
-              <w:t>3185393260</w:t>
+              <w:t>3168512676</w:t>
             </w:r>
           </w:p>
         </w:tc>
@@ -2118,11 +2226,38 @@
               <w:jc w:val="center"/>
             </w:pPr>
             <w:r>
-              <w:rPr>
-                <w:color w:val="A0A0A0"/>
-                <w:sz w:val="15"/>
-              </w:rPr>
-              <w:t>____________________</w:t>
+              <w:drawing>
+                <wp:inline xmlns:a="http://schemas.openxmlformats.org/drawingml/2006/main" xmlns:pic="http://schemas.openxmlformats.org/drawingml/2006/picture">
+                  <wp:extent cx="1366360" cy="292608"/>
+                  <wp:docPr id="10" name="Picture 10"/>
+                  <wp:cNvGraphicFramePr>
+                    <a:graphicFrameLocks noChangeAspect="1"/>
+                  </wp:cNvGraphicFramePr>
+                  <a:graphic>
+                    <a:graphicData uri="http://schemas.openxmlformats.org/drawingml/2006/picture">
+                      <pic:pic>
+                        <pic:nvPicPr>
+                          <pic:cNvPr id="0" name="image.png"/>
+                          <pic:cNvPicPr/>
+                        </pic:nvPicPr>
+                        <pic:blipFill>
+                          <a:blip r:embed="rId18"/>
+                          <a:stretch>
+                            <a:fillRect/>
+                          </a:stretch>
+                        </pic:blipFill>
+                        <pic:spPr>
+                          <a:xfrm>
+                            <a:off x="0" y="0"/>
+                            <a:ext cx="1366360" cy="292608"/>
+                          </a:xfrm>
+                          <a:prstGeom prst="rect"/>
+                        </pic:spPr>
+                      </pic:pic>
+                    </a:graphicData>
+                  </a:graphic>
+                </wp:inline>
+              </w:drawing>
             </w:r>
           </w:p>
         </w:tc>
@@ -2168,7 +2303,7 @@
                 <w:b/>
                 <w:sz w:val="17"/>
               </w:rPr>
-              <w:t>Juan Sebastian Jaramillo romero</w:t>
+              <w:t>Luis Enrique Quevedo Rojas</w:t>
             </w:r>
           </w:p>
         </w:tc>
@@ -2191,7 +2326,7 @@
               <w:rPr>
                 <w:sz w:val="17"/>
               </w:rPr>
-              <w:t>1110552017</w:t>
+              <w:t>1075208119</w:t>
             </w:r>
           </w:p>
         </w:tc>
@@ -2214,7 +2349,7 @@
               <w:rPr>
                 <w:sz w:val="17"/>
               </w:rPr>
-              <w:t>3168512676</w:t>
+              <w:t>3157056179</w:t>
             </w:r>
           </w:p>
         </w:tc>
@@ -2236,8 +2371,8 @@
             <w:r>
               <w:drawing>
                 <wp:inline xmlns:a="http://schemas.openxmlformats.org/drawingml/2006/main" xmlns:pic="http://schemas.openxmlformats.org/drawingml/2006/picture">
-                  <wp:extent cx="1366360" cy="292608"/>
-                  <wp:docPr id="6" name="Picture 6"/>
+                  <wp:extent cx="731520" cy="292608"/>
+                  <wp:docPr id="11" name="Picture 11"/>
                   <wp:cNvGraphicFramePr>
                     <a:graphicFrameLocks noChangeAspect="1"/>
                   </wp:cNvGraphicFramePr>
@@ -2249,7 +2384,7 @@
                           <pic:cNvPicPr/>
                         </pic:nvPicPr>
                         <pic:blipFill>
-                          <a:blip r:embed="rId14"/>
+                          <a:blip r:embed="rId19"/>
                           <a:stretch>
                             <a:fillRect/>
                           </a:stretch>
@@ -2257,7 +2392,7 @@
                         <pic:spPr>
                           <a:xfrm>
                             <a:off x="0" y="0"/>
-                            <a:ext cx="1366360" cy="292608"/>
+                            <a:ext cx="731520" cy="292608"/>
                           </a:xfrm>
                           <a:prstGeom prst="rect"/>
                         </pic:spPr>
@@ -2311,7 +2446,7 @@
                 <w:b/>
                 <w:sz w:val="17"/>
               </w:rPr>
-              <w:t>Luis Enrique Quevedo Rojas</w:t>
+              <w:t>John jairo Sánchez garcia</w:t>
             </w:r>
           </w:p>
         </w:tc>
@@ -2334,7 +2469,7 @@
               <w:rPr>
                 <w:sz w:val="17"/>
               </w:rPr>
-              <w:t>1075208119</w:t>
+              <w:t>79843323</w:t>
             </w:r>
           </w:p>
         </w:tc>
@@ -2357,7 +2492,7 @@
               <w:rPr>
                 <w:sz w:val="17"/>
               </w:rPr>
-              <w:t>3157056179</w:t>
+              <w:t>3108505201</w:t>
             </w:r>
           </w:p>
         </w:tc>
@@ -2379,8 +2514,8 @@
             <w:r>
               <w:drawing>
                 <wp:inline xmlns:a="http://schemas.openxmlformats.org/drawingml/2006/main" xmlns:pic="http://schemas.openxmlformats.org/drawingml/2006/picture">
-                  <wp:extent cx="813749" cy="292608"/>
-                  <wp:docPr id="7" name="Picture 7"/>
+                  <wp:extent cx="1370333" cy="292608"/>
+                  <wp:docPr id="12" name="Picture 12"/>
                   <wp:cNvGraphicFramePr>
                     <a:graphicFrameLocks noChangeAspect="1"/>
                   </wp:cNvGraphicFramePr>
@@ -2392,7 +2527,7 @@
                           <pic:cNvPicPr/>
                         </pic:nvPicPr>
                         <pic:blipFill>
-                          <a:blip r:embed="rId15"/>
+                          <a:blip r:embed="rId20"/>
                           <a:stretch>
                             <a:fillRect/>
                           </a:stretch>
@@ -2400,7 +2535,7 @@
                         <pic:spPr>
                           <a:xfrm>
                             <a:off x="0" y="0"/>
-                            <a:ext cx="813749" cy="292608"/>
+                            <a:ext cx="1370333" cy="292608"/>
                           </a:xfrm>
                           <a:prstGeom prst="rect"/>
                         </pic:spPr>
@@ -2454,7 +2589,7 @@
                 <w:b/>
                 <w:sz w:val="17"/>
               </w:rPr>
-              <w:t>John jairo Sánchez garcia</w:t>
+              <w:t>Yessica Andrea Triana Jaime</w:t>
             </w:r>
           </w:p>
         </w:tc>
@@ -2477,7 +2612,7 @@
               <w:rPr>
                 <w:sz w:val="17"/>
               </w:rPr>
-              <w:t>79843323</w:t>
+              <w:t>1083903194</w:t>
             </w:r>
           </w:p>
         </w:tc>
@@ -2500,7 +2635,7 @@
               <w:rPr>
                 <w:sz w:val="17"/>
               </w:rPr>
-              <w:t>3108505201</w:t>
+              <w:t>3138468363</w:t>
             </w:r>
           </w:p>
         </w:tc>
@@ -2522,8 +2657,8 @@
             <w:r>
               <w:drawing>
                 <wp:inline xmlns:a="http://schemas.openxmlformats.org/drawingml/2006/main" xmlns:pic="http://schemas.openxmlformats.org/drawingml/2006/picture">
-                  <wp:extent cx="1370333" cy="292608"/>
-                  <wp:docPr id="8" name="Picture 8"/>
+                  <wp:extent cx="731520" cy="292608"/>
+                  <wp:docPr id="13" name="Picture 13"/>
                   <wp:cNvGraphicFramePr>
                     <a:graphicFrameLocks noChangeAspect="1"/>
                   </wp:cNvGraphicFramePr>
@@ -2535,7 +2670,7 @@
                           <pic:cNvPicPr/>
                         </pic:nvPicPr>
                         <pic:blipFill>
-                          <a:blip r:embed="rId16"/>
+                          <a:blip r:embed="rId21"/>
                           <a:stretch>
                             <a:fillRect/>
                           </a:stretch>
@@ -2543,7 +2678,293 @@
                         <pic:spPr>
                           <a:xfrm>
                             <a:off x="0" y="0"/>
-                            <a:ext cx="1370333" cy="292608"/>
+                            <a:ext cx="731520" cy="292608"/>
+                          </a:xfrm>
+                          <a:prstGeom prst="rect"/>
+                        </pic:spPr>
+                      </pic:pic>
+                    </a:graphicData>
+                  </a:graphic>
+                </wp:inline>
+              </w:drawing>
+            </w:r>
+          </w:p>
+        </w:tc>
+      </w:tr>
+      <w:tr>
+        <w:tc>
+          <w:tcPr>
+            <w:tcW w:type="dxa" w:w="576"/>
+            <w:tcMar>
+              <w:top w:w="100" w:type="dxa"/>
+              <w:bottom w:w="100" w:type="dxa"/>
+              <w:left w:w="80" w:type="dxa"/>
+              <w:right w:w="80" w:type="dxa"/>
+            </w:tcMar>
+            <w:shd w:fill="FFFFFF"/>
+          </w:tcPr>
+          <w:p>
+            <w:pPr>
+              <w:jc w:val="center"/>
+            </w:pPr>
+            <w:r>
+              <w:rPr>
+                <w:sz w:val="17"/>
+              </w:rPr>
+              <w:t>19</w:t>
+            </w:r>
+          </w:p>
+        </w:tc>
+        <w:tc>
+          <w:tcPr>
+            <w:tcW w:type="dxa" w:w="3312"/>
+            <w:tcMar>
+              <w:top w:w="100" w:type="dxa"/>
+              <w:bottom w:w="100" w:type="dxa"/>
+              <w:left w:w="80" w:type="dxa"/>
+              <w:right w:w="80" w:type="dxa"/>
+            </w:tcMar>
+            <w:shd w:fill="FFFFFF"/>
+          </w:tcPr>
+          <w:p>
+            <w:r>
+              <w:rPr>
+                <w:b/>
+                <w:sz w:val="17"/>
+              </w:rPr>
+              <w:t>Yonier Castillo Mamian</w:t>
+            </w:r>
+          </w:p>
+        </w:tc>
+        <w:tc>
+          <w:tcPr>
+            <w:tcW w:type="dxa" w:w="1728"/>
+            <w:tcMar>
+              <w:top w:w="100" w:type="dxa"/>
+              <w:bottom w:w="100" w:type="dxa"/>
+              <w:left w:w="80" w:type="dxa"/>
+              <w:right w:w="80" w:type="dxa"/>
+            </w:tcMar>
+            <w:shd w:fill="FFFFFF"/>
+          </w:tcPr>
+          <w:p>
+            <w:pPr>
+              <w:jc w:val="center"/>
+            </w:pPr>
+            <w:r>
+              <w:rPr>
+                <w:sz w:val="17"/>
+              </w:rPr>
+              <w:t>1007393163</w:t>
+            </w:r>
+          </w:p>
+        </w:tc>
+        <w:tc>
+          <w:tcPr>
+            <w:tcW w:type="dxa" w:w="1584"/>
+            <w:tcMar>
+              <w:top w:w="100" w:type="dxa"/>
+              <w:bottom w:w="100" w:type="dxa"/>
+              <w:left w:w="80" w:type="dxa"/>
+              <w:right w:w="80" w:type="dxa"/>
+            </w:tcMar>
+            <w:shd w:fill="FFFFFF"/>
+          </w:tcPr>
+          <w:p>
+            <w:pPr>
+              <w:jc w:val="center"/>
+            </w:pPr>
+            <w:r>
+              <w:rPr>
+                <w:sz w:val="17"/>
+              </w:rPr>
+              <w:t>3146332975</w:t>
+            </w:r>
+          </w:p>
+        </w:tc>
+        <w:tc>
+          <w:tcPr>
+            <w:tcW w:type="dxa" w:w="2592"/>
+            <w:tcMar>
+              <w:top w:w="100" w:type="dxa"/>
+              <w:bottom w:w="100" w:type="dxa"/>
+              <w:left w:w="80" w:type="dxa"/>
+              <w:right w:w="80" w:type="dxa"/>
+            </w:tcMar>
+            <w:shd w:fill="FFFFFF"/>
+          </w:tcPr>
+          <w:p>
+            <w:pPr>
+              <w:jc w:val="center"/>
+            </w:pPr>
+            <w:r>
+              <w:drawing>
+                <wp:inline xmlns:a="http://schemas.openxmlformats.org/drawingml/2006/main" xmlns:pic="http://schemas.openxmlformats.org/drawingml/2006/picture">
+                  <wp:extent cx="731520" cy="292608"/>
+                  <wp:docPr id="14" name="Picture 14"/>
+                  <wp:cNvGraphicFramePr>
+                    <a:graphicFrameLocks noChangeAspect="1"/>
+                  </wp:cNvGraphicFramePr>
+                  <a:graphic>
+                    <a:graphicData uri="http://schemas.openxmlformats.org/drawingml/2006/picture">
+                      <pic:pic>
+                        <pic:nvPicPr>
+                          <pic:cNvPr id="0" name="image.png"/>
+                          <pic:cNvPicPr/>
+                        </pic:nvPicPr>
+                        <pic:blipFill>
+                          <a:blip r:embed="rId22"/>
+                          <a:stretch>
+                            <a:fillRect/>
+                          </a:stretch>
+                        </pic:blipFill>
+                        <pic:spPr>
+                          <a:xfrm>
+                            <a:off x="0" y="0"/>
+                            <a:ext cx="731520" cy="292608"/>
+                          </a:xfrm>
+                          <a:prstGeom prst="rect"/>
+                        </pic:spPr>
+                      </pic:pic>
+                    </a:graphicData>
+                  </a:graphic>
+                </wp:inline>
+              </w:drawing>
+            </w:r>
+          </w:p>
+        </w:tc>
+      </w:tr>
+      <w:tr>
+        <w:tc>
+          <w:tcPr>
+            <w:tcW w:type="dxa" w:w="576"/>
+            <w:tcMar>
+              <w:top w:w="100" w:type="dxa"/>
+              <w:bottom w:w="100" w:type="dxa"/>
+              <w:left w:w="80" w:type="dxa"/>
+              <w:right w:w="80" w:type="dxa"/>
+            </w:tcMar>
+            <w:shd w:fill="F9FAF8"/>
+          </w:tcPr>
+          <w:p>
+            <w:pPr>
+              <w:jc w:val="center"/>
+            </w:pPr>
+            <w:r>
+              <w:rPr>
+                <w:sz w:val="17"/>
+              </w:rPr>
+              <w:t>20</w:t>
+            </w:r>
+          </w:p>
+        </w:tc>
+        <w:tc>
+          <w:tcPr>
+            <w:tcW w:type="dxa" w:w="3312"/>
+            <w:tcMar>
+              <w:top w:w="100" w:type="dxa"/>
+              <w:bottom w:w="100" w:type="dxa"/>
+              <w:left w:w="80" w:type="dxa"/>
+              <w:right w:w="80" w:type="dxa"/>
+            </w:tcMar>
+            <w:shd w:fill="F9FAF8"/>
+          </w:tcPr>
+          <w:p>
+            <w:r>
+              <w:rPr>
+                <w:b/>
+                <w:sz w:val="17"/>
+              </w:rPr>
+              <w:t>Yamid René Potosí</w:t>
+            </w:r>
+          </w:p>
+        </w:tc>
+        <w:tc>
+          <w:tcPr>
+            <w:tcW w:type="dxa" w:w="1728"/>
+            <w:tcMar>
+              <w:top w:w="100" w:type="dxa"/>
+              <w:bottom w:w="100" w:type="dxa"/>
+              <w:left w:w="80" w:type="dxa"/>
+              <w:right w:w="80" w:type="dxa"/>
+            </w:tcMar>
+            <w:shd w:fill="F9FAF8"/>
+          </w:tcPr>
+          <w:p>
+            <w:pPr>
+              <w:jc w:val="center"/>
+            </w:pPr>
+            <w:r>
+              <w:rPr>
+                <w:sz w:val="17"/>
+              </w:rPr>
+              <w:t>1063808522</w:t>
+            </w:r>
+          </w:p>
+        </w:tc>
+        <w:tc>
+          <w:tcPr>
+            <w:tcW w:type="dxa" w:w="1584"/>
+            <w:tcMar>
+              <w:top w:w="100" w:type="dxa"/>
+              <w:bottom w:w="100" w:type="dxa"/>
+              <w:left w:w="80" w:type="dxa"/>
+              <w:right w:w="80" w:type="dxa"/>
+            </w:tcMar>
+            <w:shd w:fill="F9FAF8"/>
+          </w:tcPr>
+          <w:p>
+            <w:pPr>
+              <w:jc w:val="center"/>
+            </w:pPr>
+            <w:r>
+              <w:rPr>
+                <w:sz w:val="17"/>
+              </w:rPr>
+              <w:t>3042230424</w:t>
+            </w:r>
+          </w:p>
+        </w:tc>
+        <w:tc>
+          <w:tcPr>
+            <w:tcW w:type="dxa" w:w="2592"/>
+            <w:tcMar>
+              <w:top w:w="100" w:type="dxa"/>
+              <w:bottom w:w="100" w:type="dxa"/>
+              <w:left w:w="80" w:type="dxa"/>
+              <w:right w:w="80" w:type="dxa"/>
+            </w:tcMar>
+            <w:shd w:fill="F9FAF8"/>
+          </w:tcPr>
+          <w:p>
+            <w:pPr>
+              <w:jc w:val="center"/>
+            </w:pPr>
+            <w:r>
+              <w:drawing>
+                <wp:inline xmlns:a="http://schemas.openxmlformats.org/drawingml/2006/main" xmlns:pic="http://schemas.openxmlformats.org/drawingml/2006/picture">
+                  <wp:extent cx="731520" cy="292608"/>
+                  <wp:docPr id="15" name="Picture 15"/>
+                  <wp:cNvGraphicFramePr>
+                    <a:graphicFrameLocks noChangeAspect="1"/>
+                  </wp:cNvGraphicFramePr>
+                  <a:graphic>
+                    <a:graphicData uri="http://schemas.openxmlformats.org/drawingml/2006/picture">
+                      <pic:pic>
+                        <pic:nvPicPr>
+                          <pic:cNvPr id="0" name="image.png"/>
+                          <pic:cNvPicPr/>
+                        </pic:nvPicPr>
+                        <pic:blipFill>
+                          <a:blip r:embed="rId23"/>
+                          <a:stretch>
+                            <a:fillRect/>
+                          </a:stretch>
+                        </pic:blipFill>
+                        <pic:spPr>
+                          <a:xfrm>
+                            <a:off x="0" y="0"/>
+                            <a:ext cx="731520" cy="292608"/>
                           </a:xfrm>
                           <a:prstGeom prst="rect"/>
                         </pic:spPr>

</xml_diff>

<commit_message>
chore(auto): actualizar cartas con 81 estudiantes y 63 firmas [2026-10-25 18:14]
</commit_message>
<xml_diff>
--- a/cartas_solicitud/Carta_Solicitud_ELE0300116_ELECTIVA_III-MATEMATICA_FINANCIERA.docx
+++ b/cartas_solicitud/Carta_Solicitud_ELE0300116_ELECTIVA_III-MATEMATICA_FINANCIERA.docx
@@ -11,7 +11,7 @@
           <w:color w:val="646464"/>
           <w:sz w:val="20"/>
         </w:rPr>
-        <w:t>Neiva, Huila, 24 de octubre de 2026</w:t>
+        <w:t>Neiva, Huila, 25 de octubre de 2026</w:t>
         <w:br/>
       </w:r>
     </w:p>
@@ -88,7 +88,7 @@
         <w:br/>
         <w:t>• Semestre del Plan de Estudios: Semestre 9°</w:t>
         <w:br/>
-        <w:t>• Total de Estudiantes Solicitantes Preinscritos: 20 estudiantes</w:t>
+        <w:t>• Total de Estudiantes Solicitantes Preinscritos: 22 estudiantes</w:t>
       </w:r>
     </w:p>
     <w:p>
@@ -97,7 +97,7 @@
         <w:jc w:val="both"/>
       </w:pPr>
       <w:r>
-        <w:t>Manifestamos nuestro compromiso formal de matrícula y cumplimiento con los requerimientos académicos y arancelarios correspondientes al curso vacacional. Dado que contamos con un grupo sólido de 20 estudiantes interesados (superando el cupo mínimo requerido de 10 estudiantes), solicitamos su valiosa gestión ante la Coordinación Académica y la Dirección de Programa para su respectiva aprobación, asignación docente y programación de horarios.</w:t>
+        <w:t>Manifestamos nuestro compromiso formal de matrícula y cumplimiento con los requerimientos académicos y arancelarios correspondientes al curso vacacional. Dado que contamos con un grupo sólido de 22 estudiantes interesados (superando el cupo mínimo requerido de 10 estudiantes), solicitamos su valiosa gestión ante la Coordinación Académica y la Dirección de Programa para su respectiva aprobación, asignación docente y programación de horarios.</w:t>
       </w:r>
     </w:p>
     <w:p>
@@ -877,11 +877,38 @@
               <w:jc w:val="center"/>
             </w:pPr>
             <w:r>
-              <w:rPr>
-                <w:color w:val="A0A0A0"/>
-                <w:sz w:val="15"/>
-              </w:rPr>
-              <w:t>____________________</w:t>
+              <w:drawing>
+                <wp:inline xmlns:a="http://schemas.openxmlformats.org/drawingml/2006/main" xmlns:pic="http://schemas.openxmlformats.org/drawingml/2006/picture">
+                  <wp:extent cx="731520" cy="292608"/>
+                  <wp:docPr id="3" name="Picture 3"/>
+                  <wp:cNvGraphicFramePr>
+                    <a:graphicFrameLocks noChangeAspect="1"/>
+                  </wp:cNvGraphicFramePr>
+                  <a:graphic>
+                    <a:graphicData uri="http://schemas.openxmlformats.org/drawingml/2006/picture">
+                      <pic:pic>
+                        <pic:nvPicPr>
+                          <pic:cNvPr id="0" name="image.png"/>
+                          <pic:cNvPicPr/>
+                        </pic:nvPicPr>
+                        <pic:blipFill>
+                          <a:blip r:embed="rId11"/>
+                          <a:stretch>
+                            <a:fillRect/>
+                          </a:stretch>
+                        </pic:blipFill>
+                        <pic:spPr>
+                          <a:xfrm>
+                            <a:off x="0" y="0"/>
+                            <a:ext cx="731520" cy="292608"/>
+                          </a:xfrm>
+                          <a:prstGeom prst="rect"/>
+                        </pic:spPr>
+                      </pic:pic>
+                    </a:graphicData>
+                  </a:graphic>
+                </wp:inline>
+              </w:drawing>
             </w:r>
           </w:p>
         </w:tc>
@@ -996,7 +1023,7 @@
               <w:drawing>
                 <wp:inline xmlns:a="http://schemas.openxmlformats.org/drawingml/2006/main" xmlns:pic="http://schemas.openxmlformats.org/drawingml/2006/picture">
                   <wp:extent cx="543415" cy="292608"/>
-                  <wp:docPr id="3" name="Picture 3"/>
+                  <wp:docPr id="4" name="Picture 4"/>
                   <wp:cNvGraphicFramePr>
                     <a:graphicFrameLocks noChangeAspect="1"/>
                   </wp:cNvGraphicFramePr>
@@ -1008,7 +1035,7 @@
                           <pic:cNvPicPr/>
                         </pic:nvPicPr>
                         <pic:blipFill>
-                          <a:blip r:embed="rId11"/>
+                          <a:blip r:embed="rId12"/>
                           <a:stretch>
                             <a:fillRect/>
                           </a:stretch>
@@ -1139,7 +1166,7 @@
               <w:drawing>
                 <wp:inline xmlns:a="http://schemas.openxmlformats.org/drawingml/2006/main" xmlns:pic="http://schemas.openxmlformats.org/drawingml/2006/picture">
                   <wp:extent cx="731520" cy="292608"/>
-                  <wp:docPr id="4" name="Picture 4"/>
+                  <wp:docPr id="5" name="Picture 5"/>
                   <wp:cNvGraphicFramePr>
                     <a:graphicFrameLocks noChangeAspect="1"/>
                   </wp:cNvGraphicFramePr>
@@ -1151,7 +1178,7 @@
                           <pic:cNvPicPr/>
                         </pic:nvPicPr>
                         <pic:blipFill>
-                          <a:blip r:embed="rId12"/>
+                          <a:blip r:embed="rId13"/>
                           <a:stretch>
                             <a:fillRect/>
                           </a:stretch>
@@ -1282,7 +1309,7 @@
               <w:drawing>
                 <wp:inline xmlns:a="http://schemas.openxmlformats.org/drawingml/2006/main" xmlns:pic="http://schemas.openxmlformats.org/drawingml/2006/picture">
                   <wp:extent cx="875538" cy="292608"/>
-                  <wp:docPr id="5" name="Picture 5"/>
+                  <wp:docPr id="6" name="Picture 6"/>
                   <wp:cNvGraphicFramePr>
                     <a:graphicFrameLocks noChangeAspect="1"/>
                   </wp:cNvGraphicFramePr>
@@ -1294,7 +1321,7 @@
                           <pic:cNvPicPr/>
                         </pic:nvPicPr>
                         <pic:blipFill>
-                          <a:blip r:embed="rId13"/>
+                          <a:blip r:embed="rId14"/>
                           <a:stretch>
                             <a:fillRect/>
                           </a:stretch>
@@ -1425,7 +1452,7 @@
               <w:drawing>
                 <wp:inline xmlns:a="http://schemas.openxmlformats.org/drawingml/2006/main" xmlns:pic="http://schemas.openxmlformats.org/drawingml/2006/picture">
                   <wp:extent cx="877824" cy="292608"/>
-                  <wp:docPr id="6" name="Picture 6"/>
+                  <wp:docPr id="7" name="Picture 7"/>
                   <wp:cNvGraphicFramePr>
                     <a:graphicFrameLocks noChangeAspect="1"/>
                   </wp:cNvGraphicFramePr>
@@ -1437,7 +1464,7 @@
                           <pic:cNvPicPr/>
                         </pic:nvPicPr>
                         <pic:blipFill>
-                          <a:blip r:embed="rId14"/>
+                          <a:blip r:embed="rId15"/>
                           <a:stretch>
                             <a:fillRect/>
                           </a:stretch>
@@ -1568,7 +1595,7 @@
               <w:drawing>
                 <wp:inline xmlns:a="http://schemas.openxmlformats.org/drawingml/2006/main" xmlns:pic="http://schemas.openxmlformats.org/drawingml/2006/picture">
                   <wp:extent cx="731520" cy="292608"/>
-                  <wp:docPr id="7" name="Picture 7"/>
+                  <wp:docPr id="8" name="Picture 8"/>
                   <wp:cNvGraphicFramePr>
                     <a:graphicFrameLocks noChangeAspect="1"/>
                   </wp:cNvGraphicFramePr>
@@ -1580,7 +1607,7 @@
                           <pic:cNvPicPr/>
                         </pic:nvPicPr>
                         <pic:blipFill>
-                          <a:blip r:embed="rId15"/>
+                          <a:blip r:embed="rId16"/>
                           <a:stretch>
                             <a:fillRect/>
                           </a:stretch>
@@ -1711,7 +1738,7 @@
               <w:drawing>
                 <wp:inline xmlns:a="http://schemas.openxmlformats.org/drawingml/2006/main" xmlns:pic="http://schemas.openxmlformats.org/drawingml/2006/picture">
                   <wp:extent cx="809682" cy="292608"/>
-                  <wp:docPr id="8" name="Picture 8"/>
+                  <wp:docPr id="9" name="Picture 9"/>
                   <wp:cNvGraphicFramePr>
                     <a:graphicFrameLocks noChangeAspect="1"/>
                   </wp:cNvGraphicFramePr>
@@ -1723,7 +1750,7 @@
                           <pic:cNvPicPr/>
                         </pic:nvPicPr>
                         <pic:blipFill>
-                          <a:blip r:embed="rId16"/>
+                          <a:blip r:embed="rId17"/>
                           <a:stretch>
                             <a:fillRect/>
                           </a:stretch>
@@ -1785,7 +1812,7 @@
                 <w:b/>
                 <w:sz w:val="17"/>
               </w:rPr>
-              <w:t>Karen viviana Gaona Vargas</w:t>
+              <w:t>Karen viviana Gaona vargas</w:t>
             </w:r>
           </w:p>
         </w:tc>
@@ -1970,7 +1997,7 @@
               <w:drawing>
                 <wp:inline xmlns:a="http://schemas.openxmlformats.org/drawingml/2006/main" xmlns:pic="http://schemas.openxmlformats.org/drawingml/2006/picture">
                   <wp:extent cx="731520" cy="292608"/>
-                  <wp:docPr id="9" name="Picture 9"/>
+                  <wp:docPr id="10" name="Picture 10"/>
                   <wp:cNvGraphicFramePr>
                     <a:graphicFrameLocks noChangeAspect="1"/>
                   </wp:cNvGraphicFramePr>
@@ -1982,7 +2009,7 @@
                           <pic:cNvPicPr/>
                         </pic:nvPicPr>
                         <pic:blipFill>
-                          <a:blip r:embed="rId17"/>
+                          <a:blip r:embed="rId18"/>
                           <a:stretch>
                             <a:fillRect/>
                           </a:stretch>
@@ -2044,7 +2071,7 @@
                 <w:b/>
                 <w:sz w:val="17"/>
               </w:rPr>
-              <w:t>EDWIN CERQUERA</w:t>
+              <w:t>Daniel Andres Quintero Sandoval</w:t>
             </w:r>
           </w:p>
         </w:tc>
@@ -2067,7 +2094,7 @@
               <w:rPr>
                 <w:sz w:val="17"/>
               </w:rPr>
-              <w:t>1079508201</w:t>
+              <w:t>1130657578</w:t>
             </w:r>
           </w:p>
         </w:tc>
@@ -2090,266 +2117,7 @@
               <w:rPr>
                 <w:sz w:val="17"/>
               </w:rPr>
-              <w:t>3185393260</w:t>
-            </w:r>
-          </w:p>
-        </w:tc>
-        <w:tc>
-          <w:tcPr>
-            <w:tcW w:type="dxa" w:w="2592"/>
-            <w:tcMar>
-              <w:top w:w="100" w:type="dxa"/>
-              <w:bottom w:w="100" w:type="dxa"/>
-              <w:left w:w="80" w:type="dxa"/>
-              <w:right w:w="80" w:type="dxa"/>
-            </w:tcMar>
-            <w:shd w:fill="F9FAF8"/>
-          </w:tcPr>
-          <w:p>
-            <w:pPr>
-              <w:jc w:val="center"/>
-            </w:pPr>
-            <w:r>
-              <w:rPr>
-                <w:color w:val="A0A0A0"/>
-                <w:sz w:val="15"/>
-              </w:rPr>
-              <w:t>____________________</w:t>
-            </w:r>
-          </w:p>
-        </w:tc>
-      </w:tr>
-      <w:tr>
-        <w:tc>
-          <w:tcPr>
-            <w:tcW w:type="dxa" w:w="576"/>
-            <w:tcMar>
-              <w:top w:w="100" w:type="dxa"/>
-              <w:bottom w:w="100" w:type="dxa"/>
-              <w:left w:w="80" w:type="dxa"/>
-              <w:right w:w="80" w:type="dxa"/>
-            </w:tcMar>
-            <w:shd w:fill="FFFFFF"/>
-          </w:tcPr>
-          <w:p>
-            <w:pPr>
-              <w:jc w:val="center"/>
-            </w:pPr>
-            <w:r>
-              <w:rPr>
-                <w:sz w:val="17"/>
-              </w:rPr>
-              <w:t>15</w:t>
-            </w:r>
-          </w:p>
-        </w:tc>
-        <w:tc>
-          <w:tcPr>
-            <w:tcW w:type="dxa" w:w="3312"/>
-            <w:tcMar>
-              <w:top w:w="100" w:type="dxa"/>
-              <w:bottom w:w="100" w:type="dxa"/>
-              <w:left w:w="80" w:type="dxa"/>
-              <w:right w:w="80" w:type="dxa"/>
-            </w:tcMar>
-            <w:shd w:fill="FFFFFF"/>
-          </w:tcPr>
-          <w:p>
-            <w:r>
-              <w:rPr>
-                <w:b/>
-                <w:sz w:val="17"/>
-              </w:rPr>
-              <w:t>Juan Sebastian Jaramillo romero</w:t>
-            </w:r>
-          </w:p>
-        </w:tc>
-        <w:tc>
-          <w:tcPr>
-            <w:tcW w:type="dxa" w:w="1728"/>
-            <w:tcMar>
-              <w:top w:w="100" w:type="dxa"/>
-              <w:bottom w:w="100" w:type="dxa"/>
-              <w:left w:w="80" w:type="dxa"/>
-              <w:right w:w="80" w:type="dxa"/>
-            </w:tcMar>
-            <w:shd w:fill="FFFFFF"/>
-          </w:tcPr>
-          <w:p>
-            <w:pPr>
-              <w:jc w:val="center"/>
-            </w:pPr>
-            <w:r>
-              <w:rPr>
-                <w:sz w:val="17"/>
-              </w:rPr>
-              <w:t>1110552017</w:t>
-            </w:r>
-          </w:p>
-        </w:tc>
-        <w:tc>
-          <w:tcPr>
-            <w:tcW w:type="dxa" w:w="1584"/>
-            <w:tcMar>
-              <w:top w:w="100" w:type="dxa"/>
-              <w:bottom w:w="100" w:type="dxa"/>
-              <w:left w:w="80" w:type="dxa"/>
-              <w:right w:w="80" w:type="dxa"/>
-            </w:tcMar>
-            <w:shd w:fill="FFFFFF"/>
-          </w:tcPr>
-          <w:p>
-            <w:pPr>
-              <w:jc w:val="center"/>
-            </w:pPr>
-            <w:r>
-              <w:rPr>
-                <w:sz w:val="17"/>
-              </w:rPr>
-              <w:t>3168512676</w:t>
-            </w:r>
-          </w:p>
-        </w:tc>
-        <w:tc>
-          <w:tcPr>
-            <w:tcW w:type="dxa" w:w="2592"/>
-            <w:tcMar>
-              <w:top w:w="100" w:type="dxa"/>
-              <w:bottom w:w="100" w:type="dxa"/>
-              <w:left w:w="80" w:type="dxa"/>
-              <w:right w:w="80" w:type="dxa"/>
-            </w:tcMar>
-            <w:shd w:fill="FFFFFF"/>
-          </w:tcPr>
-          <w:p>
-            <w:pPr>
-              <w:jc w:val="center"/>
-            </w:pPr>
-            <w:r>
-              <w:drawing>
-                <wp:inline xmlns:a="http://schemas.openxmlformats.org/drawingml/2006/main" xmlns:pic="http://schemas.openxmlformats.org/drawingml/2006/picture">
-                  <wp:extent cx="1366360" cy="292608"/>
-                  <wp:docPr id="10" name="Picture 10"/>
-                  <wp:cNvGraphicFramePr>
-                    <a:graphicFrameLocks noChangeAspect="1"/>
-                  </wp:cNvGraphicFramePr>
-                  <a:graphic>
-                    <a:graphicData uri="http://schemas.openxmlformats.org/drawingml/2006/picture">
-                      <pic:pic>
-                        <pic:nvPicPr>
-                          <pic:cNvPr id="0" name="image.png"/>
-                          <pic:cNvPicPr/>
-                        </pic:nvPicPr>
-                        <pic:blipFill>
-                          <a:blip r:embed="rId18"/>
-                          <a:stretch>
-                            <a:fillRect/>
-                          </a:stretch>
-                        </pic:blipFill>
-                        <pic:spPr>
-                          <a:xfrm>
-                            <a:off x="0" y="0"/>
-                            <a:ext cx="1366360" cy="292608"/>
-                          </a:xfrm>
-                          <a:prstGeom prst="rect"/>
-                        </pic:spPr>
-                      </pic:pic>
-                    </a:graphicData>
-                  </a:graphic>
-                </wp:inline>
-              </w:drawing>
-            </w:r>
-          </w:p>
-        </w:tc>
-      </w:tr>
-      <w:tr>
-        <w:tc>
-          <w:tcPr>
-            <w:tcW w:type="dxa" w:w="576"/>
-            <w:tcMar>
-              <w:top w:w="100" w:type="dxa"/>
-              <w:bottom w:w="100" w:type="dxa"/>
-              <w:left w:w="80" w:type="dxa"/>
-              <w:right w:w="80" w:type="dxa"/>
-            </w:tcMar>
-            <w:shd w:fill="F9FAF8"/>
-          </w:tcPr>
-          <w:p>
-            <w:pPr>
-              <w:jc w:val="center"/>
-            </w:pPr>
-            <w:r>
-              <w:rPr>
-                <w:sz w:val="17"/>
-              </w:rPr>
-              <w:t>16</w:t>
-            </w:r>
-          </w:p>
-        </w:tc>
-        <w:tc>
-          <w:tcPr>
-            <w:tcW w:type="dxa" w:w="3312"/>
-            <w:tcMar>
-              <w:top w:w="100" w:type="dxa"/>
-              <w:bottom w:w="100" w:type="dxa"/>
-              <w:left w:w="80" w:type="dxa"/>
-              <w:right w:w="80" w:type="dxa"/>
-            </w:tcMar>
-            <w:shd w:fill="F9FAF8"/>
-          </w:tcPr>
-          <w:p>
-            <w:r>
-              <w:rPr>
-                <w:b/>
-                <w:sz w:val="17"/>
-              </w:rPr>
-              <w:t>Luis Enrique Quevedo Rojas</w:t>
-            </w:r>
-          </w:p>
-        </w:tc>
-        <w:tc>
-          <w:tcPr>
-            <w:tcW w:type="dxa" w:w="1728"/>
-            <w:tcMar>
-              <w:top w:w="100" w:type="dxa"/>
-              <w:bottom w:w="100" w:type="dxa"/>
-              <w:left w:w="80" w:type="dxa"/>
-              <w:right w:w="80" w:type="dxa"/>
-            </w:tcMar>
-            <w:shd w:fill="F9FAF8"/>
-          </w:tcPr>
-          <w:p>
-            <w:pPr>
-              <w:jc w:val="center"/>
-            </w:pPr>
-            <w:r>
-              <w:rPr>
-                <w:sz w:val="17"/>
-              </w:rPr>
-              <w:t>1075208119</w:t>
-            </w:r>
-          </w:p>
-        </w:tc>
-        <w:tc>
-          <w:tcPr>
-            <w:tcW w:type="dxa" w:w="1584"/>
-            <w:tcMar>
-              <w:top w:w="100" w:type="dxa"/>
-              <w:bottom w:w="100" w:type="dxa"/>
-              <w:left w:w="80" w:type="dxa"/>
-              <w:right w:w="80" w:type="dxa"/>
-            </w:tcMar>
-            <w:shd w:fill="F9FAF8"/>
-          </w:tcPr>
-          <w:p>
-            <w:pPr>
-              <w:jc w:val="center"/>
-            </w:pPr>
-            <w:r>
-              <w:rPr>
-                <w:sz w:val="17"/>
-              </w:rPr>
-              <w:t>3157056179</w:t>
+              <w:t>3124805685</w:t>
             </w:r>
           </w:p>
         </w:tc>
@@ -2425,7 +2193,7 @@
               <w:rPr>
                 <w:sz w:val="17"/>
               </w:rPr>
-              <w:t>17</w:t>
+              <w:t>15</w:t>
             </w:r>
           </w:p>
         </w:tc>
@@ -2446,7 +2214,7 @@
                 <w:b/>
                 <w:sz w:val="17"/>
               </w:rPr>
-              <w:t>John jairo Sánchez garcia</w:t>
+              <w:t>EDWIN CERQUERA</w:t>
             </w:r>
           </w:p>
         </w:tc>
@@ -2469,7 +2237,7 @@
               <w:rPr>
                 <w:sz w:val="17"/>
               </w:rPr>
-              <w:t>79843323</w:t>
+              <w:t>1079508201</w:t>
             </w:r>
           </w:p>
         </w:tc>
@@ -2492,7 +2260,266 @@
               <w:rPr>
                 <w:sz w:val="17"/>
               </w:rPr>
-              <w:t>3108505201</w:t>
+              <w:t>3185393260</w:t>
+            </w:r>
+          </w:p>
+        </w:tc>
+        <w:tc>
+          <w:tcPr>
+            <w:tcW w:type="dxa" w:w="2592"/>
+            <w:tcMar>
+              <w:top w:w="100" w:type="dxa"/>
+              <w:bottom w:w="100" w:type="dxa"/>
+              <w:left w:w="80" w:type="dxa"/>
+              <w:right w:w="80" w:type="dxa"/>
+            </w:tcMar>
+            <w:shd w:fill="FFFFFF"/>
+          </w:tcPr>
+          <w:p>
+            <w:pPr>
+              <w:jc w:val="center"/>
+            </w:pPr>
+            <w:r>
+              <w:rPr>
+                <w:color w:val="A0A0A0"/>
+                <w:sz w:val="15"/>
+              </w:rPr>
+              <w:t>____________________</w:t>
+            </w:r>
+          </w:p>
+        </w:tc>
+      </w:tr>
+      <w:tr>
+        <w:tc>
+          <w:tcPr>
+            <w:tcW w:type="dxa" w:w="576"/>
+            <w:tcMar>
+              <w:top w:w="100" w:type="dxa"/>
+              <w:bottom w:w="100" w:type="dxa"/>
+              <w:left w:w="80" w:type="dxa"/>
+              <w:right w:w="80" w:type="dxa"/>
+            </w:tcMar>
+            <w:shd w:fill="F9FAF8"/>
+          </w:tcPr>
+          <w:p>
+            <w:pPr>
+              <w:jc w:val="center"/>
+            </w:pPr>
+            <w:r>
+              <w:rPr>
+                <w:sz w:val="17"/>
+              </w:rPr>
+              <w:t>16</w:t>
+            </w:r>
+          </w:p>
+        </w:tc>
+        <w:tc>
+          <w:tcPr>
+            <w:tcW w:type="dxa" w:w="3312"/>
+            <w:tcMar>
+              <w:top w:w="100" w:type="dxa"/>
+              <w:bottom w:w="100" w:type="dxa"/>
+              <w:left w:w="80" w:type="dxa"/>
+              <w:right w:w="80" w:type="dxa"/>
+            </w:tcMar>
+            <w:shd w:fill="F9FAF8"/>
+          </w:tcPr>
+          <w:p>
+            <w:r>
+              <w:rPr>
+                <w:b/>
+                <w:sz w:val="17"/>
+              </w:rPr>
+              <w:t>Juan Sebastian Jaramillo romero</w:t>
+            </w:r>
+          </w:p>
+        </w:tc>
+        <w:tc>
+          <w:tcPr>
+            <w:tcW w:type="dxa" w:w="1728"/>
+            <w:tcMar>
+              <w:top w:w="100" w:type="dxa"/>
+              <w:bottom w:w="100" w:type="dxa"/>
+              <w:left w:w="80" w:type="dxa"/>
+              <w:right w:w="80" w:type="dxa"/>
+            </w:tcMar>
+            <w:shd w:fill="F9FAF8"/>
+          </w:tcPr>
+          <w:p>
+            <w:pPr>
+              <w:jc w:val="center"/>
+            </w:pPr>
+            <w:r>
+              <w:rPr>
+                <w:sz w:val="17"/>
+              </w:rPr>
+              <w:t>1110552017</w:t>
+            </w:r>
+          </w:p>
+        </w:tc>
+        <w:tc>
+          <w:tcPr>
+            <w:tcW w:type="dxa" w:w="1584"/>
+            <w:tcMar>
+              <w:top w:w="100" w:type="dxa"/>
+              <w:bottom w:w="100" w:type="dxa"/>
+              <w:left w:w="80" w:type="dxa"/>
+              <w:right w:w="80" w:type="dxa"/>
+            </w:tcMar>
+            <w:shd w:fill="F9FAF8"/>
+          </w:tcPr>
+          <w:p>
+            <w:pPr>
+              <w:jc w:val="center"/>
+            </w:pPr>
+            <w:r>
+              <w:rPr>
+                <w:sz w:val="17"/>
+              </w:rPr>
+              <w:t>3168512676</w:t>
+            </w:r>
+          </w:p>
+        </w:tc>
+        <w:tc>
+          <w:tcPr>
+            <w:tcW w:type="dxa" w:w="2592"/>
+            <w:tcMar>
+              <w:top w:w="100" w:type="dxa"/>
+              <w:bottom w:w="100" w:type="dxa"/>
+              <w:left w:w="80" w:type="dxa"/>
+              <w:right w:w="80" w:type="dxa"/>
+            </w:tcMar>
+            <w:shd w:fill="F9FAF8"/>
+          </w:tcPr>
+          <w:p>
+            <w:pPr>
+              <w:jc w:val="center"/>
+            </w:pPr>
+            <w:r>
+              <w:drawing>
+                <wp:inline xmlns:a="http://schemas.openxmlformats.org/drawingml/2006/main" xmlns:pic="http://schemas.openxmlformats.org/drawingml/2006/picture">
+                  <wp:extent cx="1366360" cy="292608"/>
+                  <wp:docPr id="12" name="Picture 12"/>
+                  <wp:cNvGraphicFramePr>
+                    <a:graphicFrameLocks noChangeAspect="1"/>
+                  </wp:cNvGraphicFramePr>
+                  <a:graphic>
+                    <a:graphicData uri="http://schemas.openxmlformats.org/drawingml/2006/picture">
+                      <pic:pic>
+                        <pic:nvPicPr>
+                          <pic:cNvPr id="0" name="image.png"/>
+                          <pic:cNvPicPr/>
+                        </pic:nvPicPr>
+                        <pic:blipFill>
+                          <a:blip r:embed="rId20"/>
+                          <a:stretch>
+                            <a:fillRect/>
+                          </a:stretch>
+                        </pic:blipFill>
+                        <pic:spPr>
+                          <a:xfrm>
+                            <a:off x="0" y="0"/>
+                            <a:ext cx="1366360" cy="292608"/>
+                          </a:xfrm>
+                          <a:prstGeom prst="rect"/>
+                        </pic:spPr>
+                      </pic:pic>
+                    </a:graphicData>
+                  </a:graphic>
+                </wp:inline>
+              </w:drawing>
+            </w:r>
+          </w:p>
+        </w:tc>
+      </w:tr>
+      <w:tr>
+        <w:tc>
+          <w:tcPr>
+            <w:tcW w:type="dxa" w:w="576"/>
+            <w:tcMar>
+              <w:top w:w="100" w:type="dxa"/>
+              <w:bottom w:w="100" w:type="dxa"/>
+              <w:left w:w="80" w:type="dxa"/>
+              <w:right w:w="80" w:type="dxa"/>
+            </w:tcMar>
+            <w:shd w:fill="FFFFFF"/>
+          </w:tcPr>
+          <w:p>
+            <w:pPr>
+              <w:jc w:val="center"/>
+            </w:pPr>
+            <w:r>
+              <w:rPr>
+                <w:sz w:val="17"/>
+              </w:rPr>
+              <w:t>17</w:t>
+            </w:r>
+          </w:p>
+        </w:tc>
+        <w:tc>
+          <w:tcPr>
+            <w:tcW w:type="dxa" w:w="3312"/>
+            <w:tcMar>
+              <w:top w:w="100" w:type="dxa"/>
+              <w:bottom w:w="100" w:type="dxa"/>
+              <w:left w:w="80" w:type="dxa"/>
+              <w:right w:w="80" w:type="dxa"/>
+            </w:tcMar>
+            <w:shd w:fill="FFFFFF"/>
+          </w:tcPr>
+          <w:p>
+            <w:r>
+              <w:rPr>
+                <w:b/>
+                <w:sz w:val="17"/>
+              </w:rPr>
+              <w:t>Luis Enrique Quevedo Rojas</w:t>
+            </w:r>
+          </w:p>
+        </w:tc>
+        <w:tc>
+          <w:tcPr>
+            <w:tcW w:type="dxa" w:w="1728"/>
+            <w:tcMar>
+              <w:top w:w="100" w:type="dxa"/>
+              <w:bottom w:w="100" w:type="dxa"/>
+              <w:left w:w="80" w:type="dxa"/>
+              <w:right w:w="80" w:type="dxa"/>
+            </w:tcMar>
+            <w:shd w:fill="FFFFFF"/>
+          </w:tcPr>
+          <w:p>
+            <w:pPr>
+              <w:jc w:val="center"/>
+            </w:pPr>
+            <w:r>
+              <w:rPr>
+                <w:sz w:val="17"/>
+              </w:rPr>
+              <w:t>1075208119</w:t>
+            </w:r>
+          </w:p>
+        </w:tc>
+        <w:tc>
+          <w:tcPr>
+            <w:tcW w:type="dxa" w:w="1584"/>
+            <w:tcMar>
+              <w:top w:w="100" w:type="dxa"/>
+              <w:bottom w:w="100" w:type="dxa"/>
+              <w:left w:w="80" w:type="dxa"/>
+              <w:right w:w="80" w:type="dxa"/>
+            </w:tcMar>
+            <w:shd w:fill="FFFFFF"/>
+          </w:tcPr>
+          <w:p>
+            <w:pPr>
+              <w:jc w:val="center"/>
+            </w:pPr>
+            <w:r>
+              <w:rPr>
+                <w:sz w:val="17"/>
+              </w:rPr>
+              <w:t>3157056179</w:t>
             </w:r>
           </w:p>
         </w:tc>
@@ -2514,8 +2541,8 @@
             <w:r>
               <w:drawing>
                 <wp:inline xmlns:a="http://schemas.openxmlformats.org/drawingml/2006/main" xmlns:pic="http://schemas.openxmlformats.org/drawingml/2006/picture">
-                  <wp:extent cx="1370333" cy="292608"/>
-                  <wp:docPr id="12" name="Picture 12"/>
+                  <wp:extent cx="731520" cy="292608"/>
+                  <wp:docPr id="13" name="Picture 13"/>
                   <wp:cNvGraphicFramePr>
                     <a:graphicFrameLocks noChangeAspect="1"/>
                   </wp:cNvGraphicFramePr>
@@ -2527,7 +2554,7 @@
                           <pic:cNvPicPr/>
                         </pic:nvPicPr>
                         <pic:blipFill>
-                          <a:blip r:embed="rId20"/>
+                          <a:blip r:embed="rId21"/>
                           <a:stretch>
                             <a:fillRect/>
                           </a:stretch>
@@ -2535,7 +2562,7 @@
                         <pic:spPr>
                           <a:xfrm>
                             <a:off x="0" y="0"/>
-                            <a:ext cx="1370333" cy="292608"/>
+                            <a:ext cx="731520" cy="292608"/>
                           </a:xfrm>
                           <a:prstGeom prst="rect"/>
                         </pic:spPr>
@@ -2589,7 +2616,7 @@
                 <w:b/>
                 <w:sz w:val="17"/>
               </w:rPr>
-              <w:t>Yessica Andrea Triana Jaime</w:t>
+              <w:t>John jairo Sánchez garcia</w:t>
             </w:r>
           </w:p>
         </w:tc>
@@ -2612,7 +2639,7 @@
               <w:rPr>
                 <w:sz w:val="17"/>
               </w:rPr>
-              <w:t>1083903194</w:t>
+              <w:t>79843323</w:t>
             </w:r>
           </w:p>
         </w:tc>
@@ -2635,7 +2662,7 @@
               <w:rPr>
                 <w:sz w:val="17"/>
               </w:rPr>
-              <w:t>3138468363</w:t>
+              <w:t>3108505201</w:t>
             </w:r>
           </w:p>
         </w:tc>
@@ -2657,8 +2684,8 @@
             <w:r>
               <w:drawing>
                 <wp:inline xmlns:a="http://schemas.openxmlformats.org/drawingml/2006/main" xmlns:pic="http://schemas.openxmlformats.org/drawingml/2006/picture">
-                  <wp:extent cx="731520" cy="292608"/>
-                  <wp:docPr id="13" name="Picture 13"/>
+                  <wp:extent cx="1370333" cy="292608"/>
+                  <wp:docPr id="14" name="Picture 14"/>
                   <wp:cNvGraphicFramePr>
                     <a:graphicFrameLocks noChangeAspect="1"/>
                   </wp:cNvGraphicFramePr>
@@ -2670,7 +2697,7 @@
                           <pic:cNvPicPr/>
                         </pic:nvPicPr>
                         <pic:blipFill>
-                          <a:blip r:embed="rId21"/>
+                          <a:blip r:embed="rId22"/>
                           <a:stretch>
                             <a:fillRect/>
                           </a:stretch>
@@ -2678,7 +2705,7 @@
                         <pic:spPr>
                           <a:xfrm>
                             <a:off x="0" y="0"/>
-                            <a:ext cx="731520" cy="292608"/>
+                            <a:ext cx="1370333" cy="292608"/>
                           </a:xfrm>
                           <a:prstGeom prst="rect"/>
                         </pic:spPr>
@@ -2732,7 +2759,7 @@
                 <w:b/>
                 <w:sz w:val="17"/>
               </w:rPr>
-              <w:t>Yonier Castillo Mamian</w:t>
+              <w:t>Yessica Andrea Triana Jaime</w:t>
             </w:r>
           </w:p>
         </w:tc>
@@ -2755,7 +2782,7 @@
               <w:rPr>
                 <w:sz w:val="17"/>
               </w:rPr>
-              <w:t>1007393163</w:t>
+              <w:t>1083903194</w:t>
             </w:r>
           </w:p>
         </w:tc>
@@ -2778,7 +2805,7 @@
               <w:rPr>
                 <w:sz w:val="17"/>
               </w:rPr>
-              <w:t>3146332975</w:t>
+              <w:t>3138468363</w:t>
             </w:r>
           </w:p>
         </w:tc>
@@ -2801,7 +2828,7 @@
               <w:drawing>
                 <wp:inline xmlns:a="http://schemas.openxmlformats.org/drawingml/2006/main" xmlns:pic="http://schemas.openxmlformats.org/drawingml/2006/picture">
                   <wp:extent cx="731520" cy="292608"/>
-                  <wp:docPr id="14" name="Picture 14"/>
+                  <wp:docPr id="15" name="Picture 15"/>
                   <wp:cNvGraphicFramePr>
                     <a:graphicFrameLocks noChangeAspect="1"/>
                   </wp:cNvGraphicFramePr>
@@ -2813,7 +2840,7 @@
                           <pic:cNvPicPr/>
                         </pic:nvPicPr>
                         <pic:blipFill>
-                          <a:blip r:embed="rId22"/>
+                          <a:blip r:embed="rId23"/>
                           <a:stretch>
                             <a:fillRect/>
                           </a:stretch>
@@ -2875,7 +2902,7 @@
                 <w:b/>
                 <w:sz w:val="17"/>
               </w:rPr>
-              <w:t>Yamid René Potosí</w:t>
+              <w:t>Yonier Castillo Mamian</w:t>
             </w:r>
           </w:p>
         </w:tc>
@@ -2898,7 +2925,7 @@
               <w:rPr>
                 <w:sz w:val="17"/>
               </w:rPr>
-              <w:t>1063808522</w:t>
+              <w:t>1007393163</w:t>
             </w:r>
           </w:p>
         </w:tc>
@@ -2921,7 +2948,7 @@
               <w:rPr>
                 <w:sz w:val="17"/>
               </w:rPr>
-              <w:t>3042230424</w:t>
+              <w:t>3146332975</w:t>
             </w:r>
           </w:p>
         </w:tc>
@@ -2944,7 +2971,7 @@
               <w:drawing>
                 <wp:inline xmlns:a="http://schemas.openxmlformats.org/drawingml/2006/main" xmlns:pic="http://schemas.openxmlformats.org/drawingml/2006/picture">
                   <wp:extent cx="731520" cy="292608"/>
-                  <wp:docPr id="15" name="Picture 15"/>
+                  <wp:docPr id="16" name="Picture 16"/>
                   <wp:cNvGraphicFramePr>
                     <a:graphicFrameLocks noChangeAspect="1"/>
                   </wp:cNvGraphicFramePr>
@@ -2956,7 +2983,293 @@
                           <pic:cNvPicPr/>
                         </pic:nvPicPr>
                         <pic:blipFill>
-                          <a:blip r:embed="rId23"/>
+                          <a:blip r:embed="rId24"/>
+                          <a:stretch>
+                            <a:fillRect/>
+                          </a:stretch>
+                        </pic:blipFill>
+                        <pic:spPr>
+                          <a:xfrm>
+                            <a:off x="0" y="0"/>
+                            <a:ext cx="731520" cy="292608"/>
+                          </a:xfrm>
+                          <a:prstGeom prst="rect"/>
+                        </pic:spPr>
+                      </pic:pic>
+                    </a:graphicData>
+                  </a:graphic>
+                </wp:inline>
+              </w:drawing>
+            </w:r>
+          </w:p>
+        </w:tc>
+      </w:tr>
+      <w:tr>
+        <w:tc>
+          <w:tcPr>
+            <w:tcW w:type="dxa" w:w="576"/>
+            <w:tcMar>
+              <w:top w:w="100" w:type="dxa"/>
+              <w:bottom w:w="100" w:type="dxa"/>
+              <w:left w:w="80" w:type="dxa"/>
+              <w:right w:w="80" w:type="dxa"/>
+            </w:tcMar>
+            <w:shd w:fill="FFFFFF"/>
+          </w:tcPr>
+          <w:p>
+            <w:pPr>
+              <w:jc w:val="center"/>
+            </w:pPr>
+            <w:r>
+              <w:rPr>
+                <w:sz w:val="17"/>
+              </w:rPr>
+              <w:t>21</w:t>
+            </w:r>
+          </w:p>
+        </w:tc>
+        <w:tc>
+          <w:tcPr>
+            <w:tcW w:type="dxa" w:w="3312"/>
+            <w:tcMar>
+              <w:top w:w="100" w:type="dxa"/>
+              <w:bottom w:w="100" w:type="dxa"/>
+              <w:left w:w="80" w:type="dxa"/>
+              <w:right w:w="80" w:type="dxa"/>
+            </w:tcMar>
+            <w:shd w:fill="FFFFFF"/>
+          </w:tcPr>
+          <w:p>
+            <w:r>
+              <w:rPr>
+                <w:b/>
+                <w:sz w:val="17"/>
+              </w:rPr>
+              <w:t>Yamid René Potosí</w:t>
+            </w:r>
+          </w:p>
+        </w:tc>
+        <w:tc>
+          <w:tcPr>
+            <w:tcW w:type="dxa" w:w="1728"/>
+            <w:tcMar>
+              <w:top w:w="100" w:type="dxa"/>
+              <w:bottom w:w="100" w:type="dxa"/>
+              <w:left w:w="80" w:type="dxa"/>
+              <w:right w:w="80" w:type="dxa"/>
+            </w:tcMar>
+            <w:shd w:fill="FFFFFF"/>
+          </w:tcPr>
+          <w:p>
+            <w:pPr>
+              <w:jc w:val="center"/>
+            </w:pPr>
+            <w:r>
+              <w:rPr>
+                <w:sz w:val="17"/>
+              </w:rPr>
+              <w:t>1063808522</w:t>
+            </w:r>
+          </w:p>
+        </w:tc>
+        <w:tc>
+          <w:tcPr>
+            <w:tcW w:type="dxa" w:w="1584"/>
+            <w:tcMar>
+              <w:top w:w="100" w:type="dxa"/>
+              <w:bottom w:w="100" w:type="dxa"/>
+              <w:left w:w="80" w:type="dxa"/>
+              <w:right w:w="80" w:type="dxa"/>
+            </w:tcMar>
+            <w:shd w:fill="FFFFFF"/>
+          </w:tcPr>
+          <w:p>
+            <w:pPr>
+              <w:jc w:val="center"/>
+            </w:pPr>
+            <w:r>
+              <w:rPr>
+                <w:sz w:val="17"/>
+              </w:rPr>
+              <w:t>3042230424</w:t>
+            </w:r>
+          </w:p>
+        </w:tc>
+        <w:tc>
+          <w:tcPr>
+            <w:tcW w:type="dxa" w:w="2592"/>
+            <w:tcMar>
+              <w:top w:w="100" w:type="dxa"/>
+              <w:bottom w:w="100" w:type="dxa"/>
+              <w:left w:w="80" w:type="dxa"/>
+              <w:right w:w="80" w:type="dxa"/>
+            </w:tcMar>
+            <w:shd w:fill="FFFFFF"/>
+          </w:tcPr>
+          <w:p>
+            <w:pPr>
+              <w:jc w:val="center"/>
+            </w:pPr>
+            <w:r>
+              <w:drawing>
+                <wp:inline xmlns:a="http://schemas.openxmlformats.org/drawingml/2006/main" xmlns:pic="http://schemas.openxmlformats.org/drawingml/2006/picture">
+                  <wp:extent cx="731520" cy="292608"/>
+                  <wp:docPr id="17" name="Picture 17"/>
+                  <wp:cNvGraphicFramePr>
+                    <a:graphicFrameLocks noChangeAspect="1"/>
+                  </wp:cNvGraphicFramePr>
+                  <a:graphic>
+                    <a:graphicData uri="http://schemas.openxmlformats.org/drawingml/2006/picture">
+                      <pic:pic>
+                        <pic:nvPicPr>
+                          <pic:cNvPr id="0" name="image.png"/>
+                          <pic:cNvPicPr/>
+                        </pic:nvPicPr>
+                        <pic:blipFill>
+                          <a:blip r:embed="rId25"/>
+                          <a:stretch>
+                            <a:fillRect/>
+                          </a:stretch>
+                        </pic:blipFill>
+                        <pic:spPr>
+                          <a:xfrm>
+                            <a:off x="0" y="0"/>
+                            <a:ext cx="731520" cy="292608"/>
+                          </a:xfrm>
+                          <a:prstGeom prst="rect"/>
+                        </pic:spPr>
+                      </pic:pic>
+                    </a:graphicData>
+                  </a:graphic>
+                </wp:inline>
+              </w:drawing>
+            </w:r>
+          </w:p>
+        </w:tc>
+      </w:tr>
+      <w:tr>
+        <w:tc>
+          <w:tcPr>
+            <w:tcW w:type="dxa" w:w="576"/>
+            <w:tcMar>
+              <w:top w:w="100" w:type="dxa"/>
+              <w:bottom w:w="100" w:type="dxa"/>
+              <w:left w:w="80" w:type="dxa"/>
+              <w:right w:w="80" w:type="dxa"/>
+            </w:tcMar>
+            <w:shd w:fill="F9FAF8"/>
+          </w:tcPr>
+          <w:p>
+            <w:pPr>
+              <w:jc w:val="center"/>
+            </w:pPr>
+            <w:r>
+              <w:rPr>
+                <w:sz w:val="17"/>
+              </w:rPr>
+              <w:t>22</w:t>
+            </w:r>
+          </w:p>
+        </w:tc>
+        <w:tc>
+          <w:tcPr>
+            <w:tcW w:type="dxa" w:w="3312"/>
+            <w:tcMar>
+              <w:top w:w="100" w:type="dxa"/>
+              <w:bottom w:w="100" w:type="dxa"/>
+              <w:left w:w="80" w:type="dxa"/>
+              <w:right w:w="80" w:type="dxa"/>
+            </w:tcMar>
+            <w:shd w:fill="F9FAF8"/>
+          </w:tcPr>
+          <w:p>
+            <w:r>
+              <w:rPr>
+                <w:b/>
+                <w:sz w:val="17"/>
+              </w:rPr>
+              <w:t>Alvaro Fernando Caviedes Rojas</w:t>
+            </w:r>
+          </w:p>
+        </w:tc>
+        <w:tc>
+          <w:tcPr>
+            <w:tcW w:type="dxa" w:w="1728"/>
+            <w:tcMar>
+              <w:top w:w="100" w:type="dxa"/>
+              <w:bottom w:w="100" w:type="dxa"/>
+              <w:left w:w="80" w:type="dxa"/>
+              <w:right w:w="80" w:type="dxa"/>
+            </w:tcMar>
+            <w:shd w:fill="F9FAF8"/>
+          </w:tcPr>
+          <w:p>
+            <w:pPr>
+              <w:jc w:val="center"/>
+            </w:pPr>
+            <w:r>
+              <w:rPr>
+                <w:sz w:val="17"/>
+              </w:rPr>
+              <w:t>7698849</w:t>
+            </w:r>
+          </w:p>
+        </w:tc>
+        <w:tc>
+          <w:tcPr>
+            <w:tcW w:type="dxa" w:w="1584"/>
+            <w:tcMar>
+              <w:top w:w="100" w:type="dxa"/>
+              <w:bottom w:w="100" w:type="dxa"/>
+              <w:left w:w="80" w:type="dxa"/>
+              <w:right w:w="80" w:type="dxa"/>
+            </w:tcMar>
+            <w:shd w:fill="F9FAF8"/>
+          </w:tcPr>
+          <w:p>
+            <w:pPr>
+              <w:jc w:val="center"/>
+            </w:pPr>
+            <w:r>
+              <w:rPr>
+                <w:sz w:val="17"/>
+              </w:rPr>
+              <w:t>3163793979</w:t>
+            </w:r>
+          </w:p>
+        </w:tc>
+        <w:tc>
+          <w:tcPr>
+            <w:tcW w:type="dxa" w:w="2592"/>
+            <w:tcMar>
+              <w:top w:w="100" w:type="dxa"/>
+              <w:bottom w:w="100" w:type="dxa"/>
+              <w:left w:w="80" w:type="dxa"/>
+              <w:right w:w="80" w:type="dxa"/>
+            </w:tcMar>
+            <w:shd w:fill="F9FAF8"/>
+          </w:tcPr>
+          <w:p>
+            <w:pPr>
+              <w:jc w:val="center"/>
+            </w:pPr>
+            <w:r>
+              <w:drawing>
+                <wp:inline xmlns:a="http://schemas.openxmlformats.org/drawingml/2006/main" xmlns:pic="http://schemas.openxmlformats.org/drawingml/2006/picture">
+                  <wp:extent cx="731520" cy="292608"/>
+                  <wp:docPr id="18" name="Picture 18"/>
+                  <wp:cNvGraphicFramePr>
+                    <a:graphicFrameLocks noChangeAspect="1"/>
+                  </wp:cNvGraphicFramePr>
+                  <a:graphic>
+                    <a:graphicData uri="http://schemas.openxmlformats.org/drawingml/2006/picture">
+                      <pic:pic>
+                        <pic:nvPicPr>
+                          <pic:cNvPr id="0" name="image.png"/>
+                          <pic:cNvPicPr/>
+                        </pic:nvPicPr>
+                        <pic:blipFill>
+                          <a:blip r:embed="rId26"/>
                           <a:stretch>
                             <a:fillRect/>
                           </a:stretch>

</xml_diff>